<commit_message>
Update report and add survey results
</commit_message>
<xml_diff>
--- a/docs/report.docx
+++ b/docs/report.docx
@@ -101,7 +101,7 @@
           <w:rtl w:val="0"/>
         </w:rPr>
         <w:tab/>
-        <w:t xml:space="preserve">Organizing student hackathons presents significant administrative and algorithmic challenges. On the administrative side, organizers struggle with fragmented workflows, including handling participation registration, team formation, submissions, and evaluations across multiple disconnected tools (e.g., Google Forms, spreadsheets, messaging apps). On the participant side, team formation is often inefficient and biased. Students frequently form teams solely based on existing social connections rather than complementary skills, leading to unbalanced teams. Unaffiliated participants (“solo registrants”) face high barriers to entry, often being assigned randomly or left out entirely. Existing hackathon platforms lack automated, multi-criteria team formation algorithms that match participants based on skill sets, experience levels, and project preferences.</w:t>
+        <w:t>Organizing student hackathons presents significant administrative and algorithmic challenges. On the administrative side, organizers struggle with fragmented workflows, including handling participation registration, team formation, submissions, and evaluations across multiple disconnected tools (e.g., Google Forms, spreadsheets, messaging apps). On the participant side, team formation is often inefficient and biased. Students frequently form teams solely based on existing social connections rather than complementary skills, leading to unbalanced teams. Unaffiliated participants ("solo registrants") face high barriers to entry, often being assigned randomly or left out entirely. The reviewed alternatives do not establish a single workflow combining full hackathon administration, explainable multi-criteria recommendations and participant confirmation. This combination motivates the proposed design.</w:t>
       </w:r>
     </w:p>
     <w:p>
@@ -659,31 +659,72 @@
         <w:rPr>
           <w:rtl w:val="0"/>
         </w:rPr>
-        <w:t xml:space="preserve">Student hackathons require participants to find teammates, choose an idea and divide responsibilities in a limited time. Students who register alone may struggle to find people with complementary skills, while organisers need to manage applications, announcements and submissions. The proposed system aims to support both processes in one place.</w:t>
+        <w:t>The Student Hackathon Survey collected 17 submissions. Thirteen respondents agreed to participate and four declined. Questions 2 to 11 each contain 13 responses, and the optional open question contains five responses. The analysis below uses the consenting responses. The questionnaire and screenshots of the response summary accompany this report in the Опросник folder.</w:t>
       </w:r>
     </w:p>
     <w:p>
       <w:pPr>
         <w:spacing w:line="480" w:lineRule="auto"/>
-        <w:rPr/>
-      </w:pPr>
-      <w:r>
-        <w:rPr>
-          <w:rtl w:val="0"/>
-        </w:rPr>
-        <w:t xml:space="preserve">Previous research gives a reason to investigate team matching rather than assume that manual selection is always sufficient. Agarwal et al. (2022) studied multi-criteria optimization for engineering student teams. Hastings et al. (2023) examined how instructors configure and assess algorithmic grouping. Mendes et al. (2022) documented coordination difficulties during online hackathons. These findings support further investigation, but they do not prove that our proposed system will improve outcomes at Astana IT University.</w:t>
+        <w:ind w:firstLine="720"/>
+        <w:rPr/>
+      </w:pPr>
+      <w:r>
+        <w:rPr>
+          <w:rtl w:val="0"/>
+        </w:rPr>
+        <w:t>In Q2, six of the 13 respondents reported no hackathon experience, three reported one event, two reported two to three events, and two reported four or more. Non-participation totals differ between Q2, Q3 and Q6. The small sample and inconsistent answers limit generalisation; question-specific totals are reported without calculating experienced-only rates.</w:t>
       </w:r>
     </w:p>
     <w:p>
       <w:pPr>
         <w:spacing w:line="480" w:lineRule="auto"/>
-        <w:rPr/>
-      </w:pPr>
-      <w:r>
-        <w:rPr>
-          <w:rtl w:val="0"/>
-        </w:rPr>
-        <w:t xml:space="preserve">A student questionnaire has been prepared to identify local difficulties, preferred team formation methods and useful platform features. It asks about prior hackathon participation, team formation, communication and the importance of skills, roles, interests and availability. Results will be added only after real responses are collected. The research will evaluate whether the proposed workflow is practical, understandable and useful.</w:t>
+        <w:ind w:firstLine="720"/>
+        <w:rPr/>
+      </w:pPr>
+      <w:r>
+        <w:rPr>
+          <w:rtl w:val="0"/>
+        </w:rPr>
+        <w:t>In Q10, six respondents (46.2%) preferred choosing teammates themselves, three (23.1%) preferred multi-criteria suggestions with a final personal choice, and one (7.7%) preferred system assignment with an option to request changes. No respondent selected organiser assignment. These preferences support voluntary recommendations and participant confirmation, but do not establish that a matching algorithm improves team performance.</w:t>
+      </w:r>
+    </w:p>
+    <w:p>
+      <w:pPr>
+        <w:spacing w:line="480" w:lineRule="auto"/>
+        <w:ind w:firstLine="720"/>
+        <w:rPr/>
+      </w:pPr>
+      <w:r>
+        <w:rPr>
+          <w:rtl w:val="0"/>
+        </w:rPr>
+        <w:t>In Q11, registration and profiles received seven selections (53.8%), judging criteria and feedback five (38.5%), and teammate search and announcements four each (30.8%). Q7 recorded three selections for different commitment levels and two for unclear roles. It also contains overlapping no-difficulty and not-applicable selections, so these results are treated as exploratory rather than estimates of problem prevalence. Two open responses suggested pre-event networking or a central platform.</w:t>
+      </w:r>
+    </w:p>
+    <w:p>
+      <w:pPr>
+        <w:spacing w:line="480" w:lineRule="auto"/>
+        <w:ind w:firstLine="720"/>
+        <w:rPr/>
+      </w:pPr>
+      <w:r>
+        <w:rPr>
+          <w:rtl w:val="0"/>
+        </w:rPr>
+        <w:t>The results support prioritising registration, participant profiles, transparent judging information and optional teammate discovery. Complementary skills remain a design criterion drawn from the literature; no respondent selected missing skills as an experienced difficulty in Q7.</w:t>
+      </w:r>
+    </w:p>
+    <w:p>
+      <w:pPr>
+        <w:spacing w:line="480" w:lineRule="auto"/>
+        <w:ind w:firstLine="720"/>
+        <w:rPr/>
+      </w:pPr>
+      <w:r>
+        <w:rPr>
+          <w:rtl w:val="0"/>
+        </w:rPr>
+        <w:t>Questionnaire: https://docs.google.com/forms/d/e/1FAIpQLSeZeYzaP4SF2Z0Tic4WnJDYXq45ePErZ1lqkmP_JJAII4qxSQ/viewform</w:t>
       </w:r>
     </w:p>
     <w:p>
@@ -3092,6 +3133,156 @@
         </w:tc>
       </w:tr>
     </w:tbl>
+    <w:p>
+      <w:pPr>
+        <w:pStyle w:val="Heading2"/>
+        <w:rPr/>
+      </w:pPr>
+      <w:r>
+        <w:rPr>
+          <w:rtl w:val="0"/>
+        </w:rPr>
+        <w:t>Empirical studies and experiments</w:t>
+      </w:r>
+    </w:p>
+    <w:p>
+      <w:pPr>
+        <w:spacing w:line="480" w:lineRule="auto"/>
+        <w:ind w:firstLine="720"/>
+        <w:rPr/>
+      </w:pPr>
+      <w:r>
+        <w:rPr>
+          <w:rtl w:val="0"/>
+        </w:rPr>
+        <w:t>The reviewed evidence includes computational experiments using real student data, a deployed matching system, observational field studies and a simulation experiment. Their methods, findings and limitations inform different parts of the proposed design.</w:t>
+      </w:r>
+    </w:p>
+    <w:p>
+      <w:pPr>
+        <w:pStyle w:val="Heading2"/>
+        <w:rPr/>
+      </w:pPr>
+      <w:r>
+        <w:rPr>
+          <w:rtl w:val="0"/>
+        </w:rPr>
+        <w:t>Agarwal and colleagues 2022   computational experiment with student data</w:t>
+      </w:r>
+    </w:p>
+    <w:p>
+      <w:pPr>
+        <w:spacing w:line="480" w:lineRule="auto"/>
+        <w:ind w:firstLine="720"/>
+        <w:rPr/>
+      </w:pPr>
+      <w:r>
+        <w:rPr>
+          <w:rtl w:val="0"/>
+        </w:rPr>
+        <w:t>Agarwal et al. (2022) used self-reported programming, spreadsheet and general computer competencies from approximately 1,300 first-year engineering students to form teams with a Vector Evaluated Genetic Algorithm. The paper compared algorithmic and manual allocations and reported a more uniform distribution of team-average skills. In one 47-student example, 100 generations with 1,500 candidate configurations took about 18 seconds. The algorithm prioritised programming when it could not minimise all objectives simultaneously. This result demonstrates a practical allocation method, but does not establish that the generated teams collaborated or learned better; evaluation of team effectiveness remained future work. For this project, the study motivates comparison against manual allocation, explicit reporting of runtime and measurement of trade-offs between criteria.</w:t>
+      </w:r>
+    </w:p>
+    <w:p>
+      <w:pPr>
+        <w:pStyle w:val="Heading2"/>
+        <w:rPr/>
+      </w:pPr>
+      <w:r>
+        <w:rPr>
+          <w:rtl w:val="0"/>
+        </w:rPr>
+        <w:t>Kohli and colleagues 2023   deployed study group matching</w:t>
+      </w:r>
+    </w:p>
+    <w:p>
+      <w:pPr>
+        <w:spacing w:line="480" w:lineRule="auto"/>
+        <w:ind w:firstLine="720"/>
+        <w:rPr/>
+      </w:pPr>
+      <w:r>
+        <w:rPr>
+          <w:rtl w:val="0"/>
+        </w:rPr>
+        <w:t>Method and setting. The authors trialled opt-in software matching in an introductory engineering and computer science course with more than 1,000 students during remote teaching. Students could request reassignment. Results. Underrepresented students were more likely to request matching; matched students reported comparable group experiences across backgrounds, and positive group experiences were associated with exam outcomes. Limitation. This was a course deployment, not a randomised student hackathon experiment; the associations do not prove a causal benefit of our proposed algorithm. Design implication. Preserve voluntary participation, reassignment and separate measures of comfort and activity.</w:t>
+      </w:r>
+    </w:p>
+    <w:p>
+      <w:pPr>
+        <w:pStyle w:val="Heading2"/>
+        <w:rPr/>
+      </w:pPr>
+      <w:r>
+        <w:rPr>
+          <w:rtl w:val="0"/>
+        </w:rPr>
+        <w:t>Mendes and colleagues 2022   four real online hackathons</w:t>
+      </w:r>
+    </w:p>
+    <w:p>
+      <w:pPr>
+        <w:spacing w:line="480" w:lineRule="auto"/>
+        <w:ind w:firstLine="720"/>
+        <w:rPr/>
+      </w:pPr>
+      <w:r>
+        <w:rPr>
+          <w:rtl w:val="0"/>
+        </w:rPr>
+        <w:t>Method and sample. A multiple-case study examined 10 teams across four online hackathons on two continents, using 27 interviews. Results. Teams combined synchronous and asynchronous tools; responsibilities were often self-selected by skill or interest. Networking and informal mentor access decreased, while multiple tools created technical and information burdens. Limitation. This observational qualitative study did not compare matching algorithms or quantify a causal effect of a central platform. Design implication. Centralise event information and submissions, make roles visible and test the complete workflow.</w:t>
+      </w:r>
+    </w:p>
+    <w:p>
+      <w:pPr>
+        <w:pStyle w:val="Heading2"/>
+        <w:rPr/>
+      </w:pPr>
+      <w:r>
+        <w:rPr>
+          <w:rtl w:val="0"/>
+        </w:rPr>
+        <w:t>Hastings and colleagues 2023   instructor use of grouping algorithms</w:t>
+      </w:r>
+    </w:p>
+    <w:p>
+      <w:pPr>
+        <w:spacing w:line="480" w:lineRule="auto"/>
+        <w:ind w:firstLine="720"/>
+        <w:rPr/>
+      </w:pPr>
+      <w:r>
+        <w:rPr>
+          <w:rtl w:val="0"/>
+        </w:rPr>
+        <w:t>Method and sample. The researchers surveyed 77 instructors and conducted 21 follow-up interviews about criteria-based grouping, including CATME. Results. Instructors checked proposed teams against educational goals but sometimes struggled to translate those goals into tool settings. Student input was often absent. Limitation. The work describes instructor practice rather than experimentally proving higher team performance. Design implication. Display matching criteria, allow organiser review and collect participant feedback.</w:t>
+      </w:r>
+    </w:p>
+    <w:p>
+      <w:pPr>
+        <w:pStyle w:val="Heading2"/>
+        <w:rPr/>
+      </w:pPr>
+      <w:r>
+        <w:rPr>
+          <w:rtl w:val="0"/>
+        </w:rPr>
+        <w:t>Vinella and colleagues 2022   simulation experiment</w:t>
+      </w:r>
+    </w:p>
+    <w:p>
+      <w:pPr>
+        <w:spacing w:line="480" w:lineRule="auto"/>
+        <w:ind w:firstLine="720"/>
+        <w:rPr/>
+      </w:pPr>
+      <w:r>
+        <w:rPr>
+          <w:rtl w:val="0"/>
+        </w:rPr>
+        <w:t>Method. The authors simulated bottom-up, top-down and hybrid team formation. Results. Self-organisation favoured the strongest teams, while the hybrid model better protected the weakest teams; mean quality did not differ significantly across models. Limitation. Outcomes were generated by an agent model and its assumptions, not observed in a live hackathon. Design implication. Compare minimum and average role coverage and unassigned participants, rather than reporting only the best team.</w:t>
+      </w:r>
+    </w:p>
     <w:p>
       <w:pPr>
         <w:pStyle w:val="Heading1"/>
@@ -5686,6 +5877,83 @@
     </w:tbl>
     <w:p>
       <w:pPr>
+        <w:pStyle w:val="Heading2"/>
+        <w:rPr/>
+      </w:pPr>
+      <w:r>
+        <w:rPr>
+          <w:rtl w:val="0"/>
+        </w:rPr>
+        <w:t>Justification for developing the proposed system</w:t>
+      </w:r>
+    </w:p>
+    <w:p>
+      <w:pPr>
+        <w:spacing w:line="480" w:lineRule="auto"/>
+        <w:ind w:firstLine="720"/>
+        <w:rPr/>
+      </w:pPr>
+      <w:r>
+        <w:rPr>
+          <w:rtl w:val="0"/>
+        </w:rPr>
+        <w:t>The proposed project addresses a specific combination of needs in student hackathons: managing the event workflow and helping participants form teams while preserving their freedom of choice. In the reviewed comparison, hackathon platforms mainly support event participation and project submission, whereas educational team-formation tools focus on allocating students to groups. The proposed system brings these functions into one workflow: participant profiles provide information for team suggestions, accepted suggestions become event teams, and those teams proceed to project submission and judging.</w:t>
+      </w:r>
+    </w:p>
+    <w:p>
+      <w:pPr>
+        <w:spacing w:line="480" w:lineRule="auto"/>
+        <w:ind w:firstLine="720"/>
+        <w:rPr/>
+      </w:pPr>
+      <w:r>
+        <w:rPr>
+          <w:rtl w:val="0"/>
+        </w:rPr>
+        <w:t>Our preliminary survey provides a local reason for this design. Of the 13 consenting respondents, seven selected registration and participant profiles as useful features, five selected judging criteria and feedback, and four selected teammate search and suggestions. Six respondents preferred choosing teammates themselves, while three preferred receiving suggestions and making the final decision personally. These findings support a platform that offers optional recommendations alongside manual team formation. However, the small sample and inconsistent answers require further validation with participants and organisers.</w:t>
+      </w:r>
+    </w:p>
+    <w:p>
+      <w:pPr>
+        <w:spacing w:line="480" w:lineRule="auto"/>
+        <w:ind w:firstLine="720"/>
+        <w:rPr/>
+      </w:pPr>
+      <w:r>
+        <w:rPr>
+          <w:rtl w:val="0"/>
+        </w:rPr>
+        <w:t>The distinctive contribution is the integration of explainable, multi-criteria team recommendations into the complete student hackathon workflow. Recommendations will consider complementary skills, preferred roles, interests and availability, explain the criteria used, and allow participants to accept or decline. Organisers will be able to review allocations and resolve cases where team constraints cannot be satisfied.</w:t>
+      </w:r>
+    </w:p>
+    <w:p>
+      <w:pPr>
+        <w:spacing w:line="480" w:lineRule="auto"/>
+        <w:ind w:firstLine="720"/>
+        <w:rPr/>
+      </w:pPr>
+      <w:r>
+        <w:rPr>
+          <w:rtl w:val="0"/>
+        </w:rPr>
+        <w:t>The development involves more than combining registration forms and dashboards. It requires implementing and evaluating a matching strategy, detecting infeasible constraints, maintaining consistent team membership during simultaneous invitations, and enforcing permissions across participants, organisers and judges. Separate forms, spreadsheets and messaging tools do not automatically enforce these connected rules. A dedicated implementation provides a consistent data model and lets the team compare matching strategies under the same conditions.</w:t>
+      </w:r>
+    </w:p>
+    <w:p>
+      <w:pPr>
+        <w:spacing w:line="480" w:lineRule="auto"/>
+        <w:ind w:firstLine="720"/>
+        <w:rPr/>
+      </w:pPr>
+      <w:r>
+        <w:rPr>
+          <w:rtl w:val="0"/>
+        </w:rPr>
+        <w:t>A dedicated implementation is justified by the need to connect event-scoped profiles, team constraints, participant decisions and submission permissions in a consistent data model. A configurable matching module also permits a controlled comparison of rule-based and weighted recommendations. The evaluation will compare the complete workflow with manual administration and measure whether this integration reduces effort while maintaining valid teams and participant choice.</w:t>
+      </w:r>
+    </w:p>
+    <w:p>
+      <w:pPr>
         <w:pStyle w:val="Heading1"/>
         <w:rPr/>
       </w:pPr>
@@ -5707,7 +5975,7 @@
         <w:rPr>
           <w:rtl w:val="0"/>
         </w:rPr>
-        <w:t xml:space="preserve">React is a suitable option for the user interface because reusable components can support registration forms, dashboards and team views. Django REST Framework and Node.js are both viable back-end approaches. Django provides an integrated application framework, while Node.js may simplify development for a team using JavaScript across the stack. PostgreSQL is appropriate for structured events, registration, profile, team and submission records. SQLite can simplify early local development but is less suitable for a multi-user production deployment. A separate matching module should be used so that a simple rule-based baseline can be compared with a weighted multi-criteria approach. GitHub will support version control, while Figma can be used for interface sketches. These choices remain proposals until the team confirms its stack.</w:t>
+        <w:t>The selected stack is Next.js with React, TypeScript and Tailwind CSS for the frontend, Node.js with Express for the REST API, and PostgreSQL for storage. React supports reusable registration forms and dashboards; a JavaScript and TypeScript stack suits the team's development experience. PostgreSQL supports the relationships and transactional updates required for registrations, invitations and memberships. The matching module separates a rule-based baseline from weighted recommendations so both can be evaluated on the same data. The comparison below records the alternatives and reasons for selection. GitHub supports version control, YouTrack task tracking, Figma interface design and Postman API testing.</w:t>
       </w:r>
     </w:p>
     <w:p>
@@ -9223,6 +9491,259 @@
     </w:p>
     <w:p>
       <w:pPr>
+        <w:spacing w:line="480" w:lineRule="auto"/>
+        <w:ind w:firstLine="720"/>
+        <w:rPr/>
+      </w:pPr>
+      <w:r>
+        <w:rPr>
+          <w:rtl w:val="0"/>
+        </w:rPr>
+        <w:t>The proposed system is a three-tier web application. A Next.js frontend built with React, TypeScript and Tailwind CSS communicates with a Node.js and Express REST API. PostgreSQL stores event-scoped records. The matching engine is a separate internal backend module with interchangeable rule-based and weighted strategies. The diagrams describe the proposed system design.</w:t>
+      </w:r>
+    </w:p>
+    <w:p>
+      <w:pPr>
+        <w:pStyle w:val="Heading2"/>
+        <w:rPr/>
+      </w:pPr>
+      <w:r>
+        <w:rPr>
+          <w:rtl w:val="0"/>
+        </w:rPr>
+        <w:t>System context diagram</w:t>
+      </w:r>
+    </w:p>
+    <w:p>
+      <w:pPr>
+        <w:spacing w:line="480" w:lineRule="auto"/>
+        <w:ind w:firstLine="0"/>
+        <w:rPr/>
+      </w:pPr>
+      <w:r>
+        <w:rPr>
+          <w:rtl w:val="0"/>
+        </w:rPr>
+      </w:r>
+      <w:r>
+        <w:drawing>
+          <wp:inline>
+            <wp:extent cx="5943600" cy="3502479"/>
+            <wp:docPr id="1" name="Picture 1"/>
+            <wp:cNvGraphicFramePr>
+              <a:graphicFrameLocks noChangeAspect="1"/>
+            </wp:cNvGraphicFramePr>
+            <a:graphic>
+              <a:graphicData uri="http://schemas.openxmlformats.org/drawingml/2006/picture">
+                <pic:pic>
+                  <pic:nvPicPr>
+                    <pic:cNvPr id="0" name="01_system_context.png"/>
+                    <pic:cNvPicPr/>
+                  </pic:nvPicPr>
+                  <pic:blipFill>
+                    <a:blip r:embed="rId28"/>
+                    <a:stretch>
+                      <a:fillRect/>
+                    </a:stretch>
+                  </pic:blipFill>
+                  <pic:spPr>
+                    <a:xfrm>
+                      <a:off x="0" y="0"/>
+                      <a:ext cx="5943600" cy="3502479"/>
+                    </a:xfrm>
+                    <a:prstGeom prst="rect"/>
+                  </pic:spPr>
+                </pic:pic>
+              </a:graphicData>
+            </a:graphic>
+          </wp:inline>
+        </w:drawing>
+      </w:r>
+    </w:p>
+    <w:p>
+      <w:pPr>
+        <w:spacing w:line="480" w:lineRule="auto"/>
+        <w:ind w:firstLine="720"/>
+        <w:rPr/>
+      </w:pPr>
+      <w:r>
+        <w:rPr>
+          <w:rtl w:val="0"/>
+        </w:rPr>
+        <w:t>Participants provide profiles, registrations and project URLs. Organisers configure events and team constraints. Judges access assigned submissions and enter scores. GitHub and demo pages are external link destinations; the system stores URLs and does not execute submitted code.</w:t>
+      </w:r>
+    </w:p>
+    <w:p>
+      <w:pPr>
+        <w:pStyle w:val="Heading2"/>
+        <w:rPr/>
+      </w:pPr>
+      <w:r>
+        <w:rPr>
+          <w:rtl w:val="0"/>
+        </w:rPr>
+        <w:t>Use Case Diagram</w:t>
+      </w:r>
+    </w:p>
+    <w:p>
+      <w:pPr>
+        <w:spacing w:line="480" w:lineRule="auto"/>
+        <w:ind w:firstLine="0"/>
+        <w:rPr/>
+      </w:pPr>
+      <w:r>
+        <w:rPr>
+          <w:rtl w:val="0"/>
+        </w:rPr>
+      </w:r>
+      <w:r>
+        <w:drawing>
+          <wp:inline>
+            <wp:extent cx="5943600" cy="5785104"/>
+            <wp:docPr id="2" name="Picture 2"/>
+            <wp:cNvGraphicFramePr>
+              <a:graphicFrameLocks noChangeAspect="1"/>
+            </wp:cNvGraphicFramePr>
+            <a:graphic>
+              <a:graphicData uri="http://schemas.openxmlformats.org/drawingml/2006/picture">
+                <pic:pic>
+                  <pic:nvPicPr>
+                    <pic:cNvPr id="0" name="02_use_cases.png"/>
+                    <pic:cNvPicPr/>
+                  </pic:nvPicPr>
+                  <pic:blipFill>
+                    <a:blip r:embed="rId29"/>
+                    <a:stretch>
+                      <a:fillRect/>
+                    </a:stretch>
+                  </pic:blipFill>
+                  <pic:spPr>
+                    <a:xfrm>
+                      <a:off x="0" y="0"/>
+                      <a:ext cx="5943600" cy="5785104"/>
+                    </a:xfrm>
+                    <a:prstGeom prst="rect"/>
+                  </pic:spPr>
+                </pic:pic>
+              </a:graphicData>
+            </a:graphic>
+          </wp:inline>
+        </w:drawing>
+      </w:r>
+    </w:p>
+    <w:p>
+      <w:pPr>
+        <w:spacing w:line="480" w:lineRule="auto"/>
+        <w:ind w:firstLine="720"/>
+        <w:rPr/>
+      </w:pPr>
+      <w:r>
+        <w:rPr>
+          <w:rtl w:val="0"/>
+        </w:rPr>
+        <w:t>The diagram shows participant, organiser and judge actions. FR-01 to FR-08 refer to the requirements in Section 6. Login is shared, and protected operations enforce both role and event permissions. Event review and announcements support the event management scope.</w:t>
+      </w:r>
+    </w:p>
+    <w:p>
+      <w:pPr>
+        <w:pStyle w:val="Heading2"/>
+        <w:rPr/>
+      </w:pPr>
+      <w:r>
+        <w:rPr>
+          <w:rtl w:val="0"/>
+        </w:rPr>
+        <w:t>Component Diagram draft</w:t>
+      </w:r>
+    </w:p>
+    <w:p>
+      <w:pPr>
+        <w:spacing w:line="480" w:lineRule="auto"/>
+        <w:ind w:firstLine="0"/>
+        <w:rPr/>
+      </w:pPr>
+      <w:r>
+        <w:rPr>
+          <w:rtl w:val="0"/>
+        </w:rPr>
+      </w:r>
+      <w:r>
+        <w:drawing>
+          <wp:inline>
+            <wp:extent cx="5943600" cy="5264331"/>
+            <wp:docPr id="3" name="Picture 3"/>
+            <wp:cNvGraphicFramePr>
+              <a:graphicFrameLocks noChangeAspect="1"/>
+            </wp:cNvGraphicFramePr>
+            <a:graphic>
+              <a:graphicData uri="http://schemas.openxmlformats.org/drawingml/2006/picture">
+                <pic:pic>
+                  <pic:nvPicPr>
+                    <pic:cNvPr id="0" name="03_components.png"/>
+                    <pic:cNvPicPr/>
+                  </pic:nvPicPr>
+                  <pic:blipFill>
+                    <a:blip r:embed="rId30"/>
+                    <a:stretch>
+                      <a:fillRect/>
+                    </a:stretch>
+                  </pic:blipFill>
+                  <pic:spPr>
+                    <a:xfrm>
+                      <a:off x="0" y="0"/>
+                      <a:ext cx="5943600" cy="5264331"/>
+                    </a:xfrm>
+                    <a:prstGeom prst="rect"/>
+                  </pic:spPr>
+                </pic:pic>
+              </a:graphicData>
+            </a:graphic>
+          </wp:inline>
+        </w:drawing>
+      </w:r>
+    </w:p>
+    <w:p>
+      <w:pPr>
+        <w:spacing w:line="480" w:lineRule="auto"/>
+        <w:ind w:firstLine="720"/>
+        <w:rPr/>
+      </w:pPr>
+      <w:r>
+        <w:rPr>
+          <w:rtl w:val="0"/>
+        </w:rPr>
+        <w:t>The API validates requests and enforces permissions before invoking domain modules. Matching reads profiles and event constraints and returns suggestions with explanations. Team management applies accepted changes. The data access layer uses transactions to prevent duplicate membership and overfull teams.</w:t>
+      </w:r>
+    </w:p>
+    <w:p>
+      <w:pPr>
+        <w:spacing w:line="480" w:lineRule="auto"/>
+        <w:ind w:firstLine="720"/>
+        <w:rPr/>
+      </w:pPr>
+      <w:r>
+        <w:rPr>
+          <w:rtl w:val="0"/>
+        </w:rPr>
+        <w:t>Alignment. FR-01 and FR-02 map to event and registration management; FR-03 to profiles; FR-04 and NFR-03 to matching and explanations; FR-05 and FR-06 to invitations and team management; FR-07 and FR-08 to submissions and judging. NFR-01 is enforced by access control, and NFR-02 by responsive frontend pages. Stored entities include users, events, registrations, profiles, teams, memberships, invitations, announcements, submissions and scores.</w:t>
+      </w:r>
+    </w:p>
+    <w:p>
+      <w:pPr>
+        <w:pStyle w:val="Heading1"/>
+        <w:rPr/>
+      </w:pPr>
+      <w:bookmarkStart w:colFirst="0" w:colLast="0" w:name="_dm8djwapsqe6" w:id="17"/>
+      <w:bookmarkEnd w:id="17"/>
+      <w:r>
+        <w:rPr>
+          <w:rtl w:val="0"/>
+        </w:rPr>
+        <w:t xml:space="preserve">8. UX / Prototype</w:t>
+      </w:r>
+    </w:p>
+    <w:p>
+      <w:pPr>
         <w:spacing w:after="240" w:before="240" w:lineRule="auto"/>
         <w:rPr/>
       </w:pPr>
@@ -9230,7 +9751,7 @@
         <w:rPr>
           <w:rtl w:val="0"/>
         </w:rPr>
-        <w:t xml:space="preserve">The system is planned as a three-tier web application: a responsive front-end, a REST API back-end and a relational database. The front-end is built with Next.js, React, TypeScript and Tailwind CSS and communicates with the back-end only through the REST API. The back-end is built with Node.js and Express. It is responsible for authentication, role-based access control, event and registration management, team handling, project submissions and judging. Data is stored in PostgreSQL. The matching algorithm is implemented as a separate module inside the back-end, so a simple rule-based baseline and the weighted multi-criteria version can be switched and compared on the same data.</w:t>
+        <w:t xml:space="preserve">The prototype will be a clickable set of interface sketches made in Figma before the front-end is implemented. It will show the main screens for the three roles and the navigation between them, and it will be used to discuss the interface with the supervisor and to prepare usability test tasks. Every screen will be designed for two widths, 375 px (phone) and 1280 px (desktop), in line with NFR-02. The style will be simple and consistent: a top navigation bar, cards for events and teams, clear forms with inline validation messages and one primary action on each screen.</w:t>
       </w:r>
     </w:p>
     <w:p>
@@ -9244,13 +9765,13 @@
           <w:iCs w:val="1"/>
           <w:rtl w:val="0"/>
         </w:rPr>
-        <w:t xml:space="preserve">System context diagram.</w:t>
-      </w:r>
-      <w:r>
-        <w:rPr>
-          <w:rtl w:val="0"/>
-        </w:rPr>
-        <w:t xml:space="preserve"> The diagram will show the system as a single block in the centre. Around it will be the three user roles: the organiser, who creates events, reviews registrations, runs team formation and publishes announcements; the participant, who registers, maintains a skill profile, reviews team suggestions and submits a project; and the judge, who scores submissions. The diagram will also show external resources that the system only links to, namely GitHub repositories and demo pages submitted by teams. Arrows will be labelled with the main data that flows between the system and each actor, for example registrations, team suggestions, project links and scores.</w:t>
+        <w:t xml:space="preserve">Registration and login.</w:t>
+      </w:r>
+      <w:r>
+        <w:rPr>
+          <w:rtl w:val="0"/>
+        </w:rPr>
+        <w:t xml:space="preserve"> Two simple forms with email, password and, for registration, full name and role. Errors such as a wrong password or an already used email appear directly under the field.</w:t>
       </w:r>
     </w:p>
     <w:p>
@@ -9264,13 +9785,13 @@
           <w:iCs w:val="1"/>
           <w:rtl w:val="0"/>
         </w:rPr>
-        <w:t xml:space="preserve">Use case diagram.</w:t>
-      </w:r>
-      <w:r>
-        <w:rPr>
-          <w:rtl w:val="0"/>
-        </w:rPr>
-        <w:t xml:space="preserve"> The diagram will group use cases by actor and by system boundary. The organiser will be connected to creating and editing events, reviewing registrations, running team formation, reassigning participants manually, publishing announcements and viewing the results. The participant will be connected to registering for an event, editing a profile, viewing team suggestions with explanations, confirming or declining a team and submitting a project. The judge will be connected to viewing assigned submissions and entering rubric scores. Shared use cases such as logging in will be included, and the use cases will be labelled with the matching requirement IDs (FR-01 to FR-08) so that the diagram can be checked against Section 6.</w:t>
+        <w:t xml:space="preserve">Participant profile.</w:t>
+      </w:r>
+      <w:r>
+        <w:rPr>
+          <w:rtl w:val="0"/>
+        </w:rPr>
+        <w:t xml:space="preserve"> A form where the student selects skills, experience level, preferred roles and interests and adds availability. A short summary card on the side shows how the profile looks to the matching module. Saved values stay after logging in again (FR-03).</w:t>
       </w:r>
     </w:p>
     <w:p>
@@ -9284,13 +9805,13 @@
           <w:iCs w:val="1"/>
           <w:rtl w:val="0"/>
         </w:rPr>
-        <w:t xml:space="preserve">Component diagram (draft).</w:t>
-      </w:r>
-      <w:r>
-        <w:rPr>
-          <w:rtl w:val="0"/>
-        </w:rPr>
-        <w:t xml:space="preserve"> The draft will show the Next.js front-end with its main parts (pages, shared UI components and an API client) connected to the Express back-end over HTTP. Inside the back-end, the diagram will show the authentication and access control component, the event and registration component, the profile component, the matching module, the team management component, the submission and judging component, and the data access layer connected to the PostgreSQL database. The matching module will have two clearly separated strategies, the baseline and the weighted multi-criteria one, and will return suggestions together with the criteria used. Testing tools (Postman and automated tests) will be shown as external clients of the API. The diagram is a draft and may change when the API contract and the database schema are finalised.</w:t>
+        <w:t xml:space="preserve">Events list and event page.</w:t>
+      </w:r>
+      <w:r>
+        <w:rPr>
+          <w:rtl w:val="0"/>
+        </w:rPr>
+        <w:t xml:space="preserve"> A list of cards with the event title, dates and status, and a detail page with rules, tracks, team size limits and announcements. A single "Register" button confirms the registration, and a duplicate attempt shows a clear message (FR-02).</w:t>
       </w:r>
     </w:p>
     <w:p>
@@ -9304,44 +9825,13 @@
           <w:iCs w:val="1"/>
           <w:rtl w:val="0"/>
         </w:rPr>
-        <w:t xml:space="preserve">Alignment.</w:t>
-      </w:r>
-      <w:r>
-        <w:rPr>
-          <w:rtl w:val="0"/>
-        </w:rPr>
-        <w:t xml:space="preserve"> Each requirement in Section 6 will be traced to a component and to at least one use case, and the entities shown in the database schema (users, events, registrations, teams, submissions, scores) will match the data that the diagrams show flowing between components. This makes it possible to check that requirements, components, data and scenarios are consistent.</w:t>
-      </w:r>
-      <w:r>
-        <w:rPr>
-          <w:rtl w:val="0"/>
-        </w:rPr>
-      </w:r>
-    </w:p>
-    <w:p>
-      <w:pPr>
-        <w:pStyle w:val="Heading1"/>
-        <w:rPr/>
-      </w:pPr>
-      <w:bookmarkStart w:colFirst="0" w:colLast="0" w:name="_dm8djwapsqe6" w:id="17"/>
-      <w:bookmarkEnd w:id="17"/>
-      <w:r>
-        <w:rPr>
-          <w:rtl w:val="0"/>
-        </w:rPr>
-        <w:t xml:space="preserve">8. UX / Prototype</w:t>
-      </w:r>
-    </w:p>
-    <w:p>
-      <w:pPr>
-        <w:spacing w:after="240" w:before="240" w:lineRule="auto"/>
-        <w:rPr/>
-      </w:pPr>
-      <w:r>
-        <w:rPr>
-          <w:rtl w:val="0"/>
-        </w:rPr>
-        <w:t xml:space="preserve">The prototype will be a clickable set of interface sketches made in Figma before the front-end is implemented. It will show the main screens for the three roles and the navigation between them, and it will be used to discuss the interface with the supervisor and to prepare usability test tasks. Every screen will be designed for two widths, 375 px (phone) and 1280 px (desktop), in line with NFR-02. The style will be simple and consistent: a top navigation bar, cards for events and teams, clear forms with inline validation messages and one primary action on each screen.</w:t>
+        <w:t xml:space="preserve">Team suggestions.</w:t>
+      </w:r>
+      <w:r>
+        <w:rPr>
+          <w:rtl w:val="0"/>
+        </w:rPr>
+        <w:t xml:space="preserve"> The key screen for participants. It shows one or several suggested teams as cards with the members, their roles and a match indicator. Each suggestion includes a short explanation of the criteria used, for example complementary skills and role coverage (NFR-03). The student can confirm or decline the invitation with two buttons, and the team status updates immediately (FR-05). If no feasible team exists, the screen shows a clear warning instead of an invalid team.</w:t>
       </w:r>
     </w:p>
     <w:p>
@@ -9355,13 +9845,13 @@
           <w:iCs w:val="1"/>
           <w:rtl w:val="0"/>
         </w:rPr>
-        <w:t xml:space="preserve">Registration and login.</w:t>
-      </w:r>
-      <w:r>
-        <w:rPr>
-          <w:rtl w:val="0"/>
-        </w:rPr>
-        <w:t xml:space="preserve"> Two simple forms with email, password and, for registration, full name and role. Errors such as a wrong password or an already used email appear directly under the field.</w:t>
+        <w:t xml:space="preserve">Organiser dashboard.</w:t>
+      </w:r>
+      <w:r>
+        <w:rPr>
+          <w:rtl w:val="0"/>
+        </w:rPr>
+        <w:t xml:space="preserve"> A page with tabs for registrations, teams, announcements and results. The registrations tab shows a table of participants with filters by skills and roles. A "Form teams" button starts the matching, and the teams tab shows the result as cards with warnings for teams that break the constraints. The organiser can move a participant between teams by selecting a new team, and the system checks the size limits before saving (FR-06). The same dashboard allows creating and editing events (FR-01) and publishing announcements.</w:t>
       </w:r>
     </w:p>
     <w:p>
@@ -9375,13 +9865,13 @@
           <w:iCs w:val="1"/>
           <w:rtl w:val="0"/>
         </w:rPr>
-        <w:t xml:space="preserve">Participant profile.</w:t>
-      </w:r>
-      <w:r>
-        <w:rPr>
-          <w:rtl w:val="0"/>
-        </w:rPr>
-        <w:t xml:space="preserve"> A form where the student selects skills, experience level, preferred roles and interests and adds availability. A short summary card on the side shows how the profile looks to the matching module. Saved values stay after logging in again (FR-03).</w:t>
+        <w:t xml:space="preserve">Project submission.</w:t>
+      </w:r>
+      <w:r>
+        <w:rPr>
+          <w:rtl w:val="0"/>
+        </w:rPr>
+        <w:t xml:space="preserve"> A short form where a team enters the repository and demo links before the deadline, with a countdown and a confirmation after saving (FR-07).</w:t>
       </w:r>
     </w:p>
     <w:p>
@@ -9395,86 +9885,6 @@
           <w:iCs w:val="1"/>
           <w:rtl w:val="0"/>
         </w:rPr>
-        <w:t xml:space="preserve">Events list and event page.</w:t>
-      </w:r>
-      <w:r>
-        <w:rPr>
-          <w:rtl w:val="0"/>
-        </w:rPr>
-        <w:t xml:space="preserve"> A list of cards with the event title, dates and status, and a detail page with rules, tracks, team size limits and announcements. A single “Register” button confirms the registration, and a duplicate attempt shows a clear message (FR-02).</w:t>
-      </w:r>
-    </w:p>
-    <w:p>
-      <w:pPr>
-        <w:spacing w:after="240" w:before="240" w:lineRule="auto"/>
-        <w:rPr/>
-      </w:pPr>
-      <w:r>
-        <w:rPr>
-          <w:i w:val="1"/>
-          <w:iCs w:val="1"/>
-          <w:rtl w:val="0"/>
-        </w:rPr>
-        <w:t xml:space="preserve">Team suggestions.</w:t>
-      </w:r>
-      <w:r>
-        <w:rPr>
-          <w:rtl w:val="0"/>
-        </w:rPr>
-        <w:t xml:space="preserve"> The key screen for participants. It shows one or several suggested teams as cards with the members, their roles and a match indicator. Each suggestion includes a short explanation of the criteria used, for example complementary skills and role coverage (NFR-03). The student can confirm or decline the invitation with two buttons, and the team status updates immediately (FR-05). If no feasible team exists, the screen shows a clear warning instead of an invalid team.</w:t>
-      </w:r>
-    </w:p>
-    <w:p>
-      <w:pPr>
-        <w:spacing w:after="240" w:before="240" w:lineRule="auto"/>
-        <w:rPr/>
-      </w:pPr>
-      <w:r>
-        <w:rPr>
-          <w:i w:val="1"/>
-          <w:iCs w:val="1"/>
-          <w:rtl w:val="0"/>
-        </w:rPr>
-        <w:t xml:space="preserve">Organiser dashboard.</w:t>
-      </w:r>
-      <w:r>
-        <w:rPr>
-          <w:rtl w:val="0"/>
-        </w:rPr>
-        <w:t xml:space="preserve"> A page with tabs for registrations, teams, announcements and results. The registrations tab shows a table of participants with filters by skills and roles. A “Form teams” button starts the matching, and the teams tab shows the result as cards with warnings for teams that break the constraints. The organiser can move a participant between teams by selecting a new team, and the system checks the size limits before saving (FR-06). The same dashboard allows creating and editing events (FR-01) and publishing announcements.</w:t>
-      </w:r>
-    </w:p>
-    <w:p>
-      <w:pPr>
-        <w:spacing w:after="240" w:before="240" w:lineRule="auto"/>
-        <w:rPr/>
-      </w:pPr>
-      <w:r>
-        <w:rPr>
-          <w:i w:val="1"/>
-          <w:iCs w:val="1"/>
-          <w:rtl w:val="0"/>
-        </w:rPr>
-        <w:t xml:space="preserve">Project submission.</w:t>
-      </w:r>
-      <w:r>
-        <w:rPr>
-          <w:rtl w:val="0"/>
-        </w:rPr>
-        <w:t xml:space="preserve"> A short form where a team enters the repository and demo links before the deadline, with a countdown and a confirmation after saving (FR-07).</w:t>
-      </w:r>
-    </w:p>
-    <w:p>
-      <w:pPr>
-        <w:spacing w:after="240" w:before="240" w:lineRule="auto"/>
-        <w:rPr/>
-      </w:pPr>
-      <w:r>
-        <w:rPr>
-          <w:i w:val="1"/>
-          <w:iCs w:val="1"/>
-          <w:rtl w:val="0"/>
-        </w:rPr>
         <w:t xml:space="preserve">Judging and results.</w:t>
       </w:r>
       <w:r>
@@ -9518,37 +9928,103 @@
     <w:p>
       <w:pPr>
         <w:spacing w:line="480" w:lineRule="auto"/>
-        <w:rPr/>
-      </w:pPr>
-      <w:r>
-        <w:rPr>
-          <w:rtl w:val="0"/>
-        </w:rPr>
-        <w:t xml:space="preserve">The evaluation will combine technical tests, task-based usability testing and survey feedback. The matching algorithm can be compared with manual allocation or a simple baseline using the same participant profiles and event constraints. Technical measures include team formation time, unassigned participants, unmet constraints and required-role coverage. User evaluation should separately measure perceived fairness, clarity of suggestions and satisfaction.</w:t>
+        <w:ind w:firstLine="720"/>
+        <w:rPr/>
+      </w:pPr>
+      <w:r>
+        <w:rPr>
+          <w:rtl w:val="0"/>
+        </w:rPr>
+        <w:t>Evaluation will compare allocation quality, task completion and technical correctness. The student questionnaire provides preliminary preference data. Algorithm benchmarks and usability trials are planned after implementation.</w:t>
+      </w:r>
+    </w:p>
+    <w:p>
+      <w:pPr>
+        <w:pStyle w:val="Heading2"/>
+        <w:rPr/>
+      </w:pPr>
+      <w:r>
+        <w:rPr>
+          <w:rtl w:val="0"/>
+        </w:rPr>
+        <w:t>Algorithm comparison protocol</w:t>
       </w:r>
     </w:p>
     <w:p>
       <w:pPr>
         <w:spacing w:line="480" w:lineRule="auto"/>
-        <w:rPr/>
-      </w:pPr>
-      <w:r>
-        <w:rPr>
-          <w:rtl w:val="0"/>
-        </w:rPr>
-        <w:t xml:space="preserve">The student questionnaire contains twelve questions, including consent, previous participation, team formation experience, difficulties, important criteria, preferred methods and desired platform features. A small pilot with three to five students is recommended to check wording. Recruitment will use a convenience sample and results must be reported with their limitations. No survey response counts or findings are claimed before collection.</w:t>
+        <w:ind w:firstLine="720"/>
+        <w:rPr/>
+      </w:pPr>
+      <w:r>
+        <w:rPr>
+          <w:rtl w:val="0"/>
+        </w:rPr>
+        <w:t>Use one versioned profile dataset and identical team-size, availability and role constraints for all methods. Compare deterministic rule-based allocation, weighted multi-criteria allocation and organiser allocation where an organiser is available. Run random allocation as an additional comparator over 30 recorded seeds. Separate real, consented profiles from synthetic stress cases and report them separately. The questionnaire responses are preference data, not a complete matching-profile dataset.</w:t>
       </w:r>
     </w:p>
     <w:p>
       <w:pPr>
         <w:spacing w:line="480" w:lineRule="auto"/>
-        <w:rPr/>
-      </w:pPr>
-      <w:r>
-        <w:rPr>
-          <w:rtl w:val="0"/>
-        </w:rPr>
-        <w:t xml:space="preserve">Verification will check that the system works according to the requirements. Each functional requirement will be linked to at least one test case, including negative cases such as invalid registration or a participant trying to use organiser functions. The back-end will be tested through API tests in Postman, and the matching algorithm will have separate unit tests for edge cases such as an odd number of participants or incomplete profiles. End-to-end scenarios will check the full flow through the interface, from event creation to participants seeing their teams. Defects will be recorded with steps to reproduce and severity, and regression tests will be repeated after fixes and before the final demonstration.</w:t>
+        <w:ind w:firstLine="720"/>
+        <w:rPr/>
+      </w:pPr>
+      <w:r>
+        <w:rPr>
+          <w:rtl w:val="0"/>
+        </w:rPr>
+        <w:t>Record dataset size, hardware, code revision, weights, seeds and runtime. Measure valid membership assignments, duplicate memberships, unassigned participants, required-role coverage per team, minimum team coverage, availability overlap, and elapsed formation time. Count mandatory-constraint violations separately from preference scores. Role coverage is filled required roles divided by required roles, averaged over teams; unassigned rate is eligible unassigned participants divided by all eligible participants. Record organiser effort separately from execution time.</w:t>
+      </w:r>
+    </w:p>
+    <w:p>
+      <w:pPr>
+        <w:spacing w:line="480" w:lineRule="auto"/>
+        <w:ind w:firstLine="720"/>
+        <w:rPr/>
+      </w:pPr>
+      <w:r>
+        <w:rPr>
+          <w:rtl w:val="0"/>
+        </w:rPr>
+        <w:t>The evaluation targets are zero duplicate memberships and zero mandatory-constraint violations on feasible cases, with an explicit unresolved status for infeasible cases. Weighted matching is expected to preserve the assigned-participant count and improve mean role coverage relative to the rule-based baseline. Minimum team coverage and any trade-offs will be reported alongside averages.</w:t>
+      </w:r>
+    </w:p>
+    <w:p>
+      <w:pPr>
+        <w:pStyle w:val="Heading2"/>
+        <w:rPr/>
+      </w:pPr>
+      <w:r>
+        <w:rPr>
+          <w:rtl w:val="0"/>
+        </w:rPr>
+        <w:t>Usability and technical verification</w:t>
+      </w:r>
+    </w:p>
+    <w:p>
+      <w:pPr>
+        <w:spacing w:line="480" w:lineRule="auto"/>
+        <w:ind w:firstLine="720"/>
+        <w:rPr/>
+      </w:pPr>
+      <w:r>
+        <w:rPr>
+          <w:rtl w:val="0"/>
+        </w:rPr>
+        <w:t>Recruit 5-8 consenting students and at least one organiser for a formative task trial after the prototype exists. Tasks cover registration, profile editing, understanding a suggestion, accepting or declining a team, and project submission; the organiser creates an event and resolves a team issue. Record unaided completion, time, errors, requests for help and a post-task clarity rating from 1 to 5. Proposed formative gate: at least 80% unaided task completion and no unresolved critical blocker. This small test diagnoses usability problems and does not estimate population-level effectiveness.</w:t>
+      </w:r>
+    </w:p>
+    <w:p>
+      <w:pPr>
+        <w:spacing w:line="480" w:lineRule="auto"/>
+        <w:ind w:firstLine="720"/>
+        <w:rPr/>
+      </w:pPr>
+      <w:r>
+        <w:rPr>
+          <w:rtl w:val="0"/>
+        </w:rPr>
+        <w:t>Each functional requirement will be checked through positive and negative API tests. Cases include duplicate registration, cross-event access, participant access to organiser APIs, concurrent team confirmations, full teams, impossible constraints, late submissions and judge access to unassigned projects. Interface checks will use the mobile and desktop widths in NFR-02. Defects and regression results will be recorded in YouTrack. Research records will include consent, collection dates, recruitment channels and question-specific response totals.</w:t>
       </w:r>
     </w:p>
     <w:p>
@@ -9568,25 +10044,563 @@
     <w:p>
       <w:pPr>
         <w:spacing w:line="480" w:lineRule="auto"/>
-        <w:rPr/>
-      </w:pPr>
-      <w:r>
-        <w:rPr>
-          <w:rtl w:val="0"/>
-        </w:rPr>
-        <w:t xml:space="preserve">Project tasks will be tracked on a Kanban board with Tasks, In Progress, Testing, Ready to release and Done stages. Work includes research, requirements, interface design, back-end development, matching algorithm, integration, testing and documentation. Progress should be reviewed regularly, and task ownership should be recorded in the actual project board. Responsibilities follow the team roles. Elkham Mamedov is responsible for requirements analysis, QA, integration and documentation. Ilnur Saipiev is responsible for the back-end, the database and the matching algorithm. Alisher Askar is responsible for the front-end.</w:t>
+        <w:ind w:firstLine="720"/>
+        <w:rPr/>
+      </w:pPr>
+      <w:r>
+        <w:rPr>
+          <w:rtl w:val="0"/>
+        </w:rPr>
+        <w:t>Elkham Mamedov is responsible for requirements analysis, QA, integration and documentation. Ilnur Saipiyev is responsible for the backend, database and matching algorithm. Alisher Askar is responsible for the frontend. The project is at the analysis, design and initial technical setup stage.</w:t>
       </w:r>
     </w:p>
     <w:p>
       <w:pPr>
         <w:spacing w:line="480" w:lineRule="auto"/>
-        <w:rPr/>
-      </w:pPr>
-      <w:r>
-        <w:rPr>
-          <w:rtl w:val="0"/>
-        </w:rPr>
-        <w:t xml:space="preserve">Main risks include low survey participation, biased sampling, incomplete participant profiles, conflicting team preferences, infeasible constraints and limited time for testing. Mitigation measures include piloting the questionnaire, reporting sampling limitations, supporting manual organiser adjustments, providing explanations for infeasible allocations and implementing a simple matching baseline before advanced optimisation.</w:t>
+        <w:ind w:firstLine="720"/>
+        <w:rPr/>
+      </w:pPr>
+      <w:r>
+        <w:rPr>
+          <w:rtl w:val="0"/>
+        </w:rPr>
+        <w:t>Project documentation is maintained in the hackmatch-diploma GitHub organisation. Separate repositories are available for frontend and backend development. The project README links to the YouTrack board. Repository availability does not establish that implementation or evaluation is complete.</w:t>
+      </w:r>
+    </w:p>
+    <w:p>
+      <w:pPr>
+        <w:spacing w:line="480" w:lineRule="auto"/>
+        <w:ind w:firstLine="720"/>
+        <w:rPr/>
+      </w:pPr>
+      <w:r>
+        <w:rPr>
+          <w:rtl w:val="0"/>
+        </w:rPr>
+        <w:t>Project organisation: https://github.com/orgs/hackmatch-diploma/repositories</w:t>
+      </w:r>
+    </w:p>
+    <w:p>
+      <w:pPr>
+        <w:spacing w:line="480" w:lineRule="auto"/>
+        <w:ind w:firstLine="720"/>
+        <w:rPr/>
+      </w:pPr>
+      <w:r>
+        <w:rPr>
+          <w:rtl w:val="0"/>
+        </w:rPr>
+        <w:t>Documentation and project overview: https://github.com/hackmatch-diploma/.github</w:t>
+      </w:r>
+    </w:p>
+    <w:p>
+      <w:pPr>
+        <w:spacing w:line="480" w:lineRule="auto"/>
+        <w:ind w:firstLine="720"/>
+        <w:rPr/>
+      </w:pPr>
+      <w:r>
+        <w:rPr>
+          <w:rtl w:val="0"/>
+        </w:rPr>
+        <w:t>Frontend: https://github.com/hackmatch-diploma/hackmatch-frontend</w:t>
+      </w:r>
+    </w:p>
+    <w:p>
+      <w:pPr>
+        <w:spacing w:line="480" w:lineRule="auto"/>
+        <w:ind w:firstLine="720"/>
+        <w:rPr/>
+      </w:pPr>
+      <w:r>
+        <w:rPr>
+          <w:rtl w:val="0"/>
+        </w:rPr>
+        <w:t>Backend: https://github.com/hackmatch-diploma/hackmatch-backend</w:t>
+      </w:r>
+    </w:p>
+    <w:p>
+      <w:pPr>
+        <w:spacing w:line="480" w:lineRule="auto"/>
+        <w:ind w:firstLine="720"/>
+        <w:rPr/>
+      </w:pPr>
+      <w:r>
+        <w:rPr>
+          <w:rtl w:val="0"/>
+        </w:rPr>
+        <w:t>YouTrack: https://hackmatch.youtrack.cloud/agiles/204-0/current</w:t>
+      </w:r>
+    </w:p>
+    <w:p>
+      <w:pPr>
+        <w:spacing w:line="480" w:lineRule="auto"/>
+        <w:ind w:firstLine="720"/>
+        <w:rPr/>
+      </w:pPr>
+      <w:r>
+        <w:rPr>
+          <w:rtl w:val="0"/>
+        </w:rPr>
+        <w:t>The development workflow links work items to an owner, acceptance criteria, deadline and relevant code or documentation changes. Feature branches and pull requests provide review points; release tags will identify submitted versions. These are planned development practices rather than claims that every review or release checkpoint has already been completed.</w:t>
+      </w:r>
+    </w:p>
+    <w:p>
+      <w:pPr>
+        <w:pStyle w:val="Heading2"/>
+        <w:rPr/>
+      </w:pPr>
+      <w:r>
+        <w:rPr>
+          <w:rtl w:val="0"/>
+        </w:rPr>
+        <w:t>Risk assessment approach</w:t>
+      </w:r>
+    </w:p>
+    <w:p>
+      <w:pPr>
+        <w:spacing w:line="480" w:lineRule="auto"/>
+        <w:ind w:firstLine="720"/>
+        <w:rPr/>
+      </w:pPr>
+      <w:r>
+        <w:rPr>
+          <w:rtl w:val="0"/>
+        </w:rPr>
+        <w:t>Likelihood and impact are rated from 1 (low) to 3 (high). Their product determines priority: 6 to 9 is high, 3 to 4 medium, and 1 to 2 low. The ratings are initial estimates. Each risk has an owner, an observable trigger, preventive measures and a contingency response. Risks will be reviewed weekly and when a trigger occurs.</w:t>
+      </w:r>
+    </w:p>
+    <w:p>
+      <w:pPr>
+        <w:pStyle w:val="Heading2"/>
+        <w:rPr/>
+      </w:pPr>
+      <w:r>
+        <w:rPr>
+          <w:rtl w:val="0"/>
+        </w:rPr>
+        <w:t>R1 Insufficient or inconsistent research data</w:t>
+      </w:r>
+    </w:p>
+    <w:p>
+      <w:pPr>
+        <w:spacing w:line="480" w:lineRule="auto"/>
+        <w:ind w:firstLine="720"/>
+        <w:rPr/>
+      </w:pPr>
+      <w:r>
+        <w:rPr>
+          <w:rtl w:val="0"/>
+        </w:rPr>
+        <w:t>Priority: 3 x 2 = 6 high. Owner: Elkham Mamedov. Small convenience sample, non-participants and contradictory answers may produce misleading requirements. Trigger: inconsistent experience answers remain unresolved or no organiser is interviewed.</w:t>
+      </w:r>
+    </w:p>
+    <w:p>
+      <w:pPr>
+        <w:spacing w:line="480" w:lineRule="auto"/>
+        <w:ind w:firstLine="720"/>
+        <w:rPr/>
+      </w:pPr>
+      <w:r>
+        <w:rPr>
+          <w:rtl w:val="0"/>
+        </w:rPr>
+        <w:t>Mitigation: Validate responses with consent; recruit experienced participants and conduct 3-5 user discussions. Record the recruitment method and exclusions.</w:t>
+      </w:r>
+    </w:p>
+    <w:p>
+      <w:pPr>
+        <w:spacing w:line="480" w:lineRule="auto"/>
+        <w:ind w:firstLine="720"/>
+        <w:rPr/>
+      </w:pPr>
+      <w:r>
+        <w:rPr>
+          <w:rtl w:val="0"/>
+        </w:rPr>
+        <w:t>Contingency: Report preliminary results only; avoid subgroup claims; prioritise requirements confirmed by an organiser.</w:t>
+      </w:r>
+    </w:p>
+    <w:p>
+      <w:pPr>
+        <w:pStyle w:val="Heading2"/>
+        <w:rPr/>
+      </w:pPr>
+      <w:r>
+        <w:rPr>
+          <w:rtl w:val="0"/>
+        </w:rPr>
+        <w:t>R2 Infeasible team constraints</w:t>
+      </w:r>
+    </w:p>
+    <w:p>
+      <w:pPr>
+        <w:spacing w:line="480" w:lineRule="auto"/>
+        <w:ind w:firstLine="720"/>
+        <w:rPr/>
+      </w:pPr>
+      <w:r>
+        <w:rPr>
+          <w:rtl w:val="0"/>
+        </w:rPr>
+        <w:t>Priority: 3 x 3 = 9 high. Owner: Ilnur Saipiyev. Team size, availability and role demand may conflict with the available pool. Trigger: the feasibility check cannot place all eligible participants.</w:t>
+      </w:r>
+    </w:p>
+    <w:p>
+      <w:pPr>
+        <w:spacing w:line="480" w:lineRule="auto"/>
+        <w:ind w:firstLine="720"/>
+        <w:rPr/>
+      </w:pPr>
+      <w:r>
+        <w:rPr>
+          <w:rtl w:val="0"/>
+        </w:rPr>
+        <w:t>Mitigation: Separate mandatory rules from preferences; validate role supply and size arithmetic before matching. Test small and odd participant pools.</w:t>
+      </w:r>
+    </w:p>
+    <w:p>
+      <w:pPr>
+        <w:spacing w:line="480" w:lineRule="auto"/>
+        <w:ind w:firstLine="720"/>
+        <w:rPr/>
+      </w:pPr>
+      <w:r>
+        <w:rPr>
+          <w:rtl w:val="0"/>
+        </w:rPr>
+        <w:t>Contingency: Leave affected participants explicitly unassigned and show the cause; let the organiser change optional criteria with confirmation. Never silently violate a mandatory rule.</w:t>
+      </w:r>
+    </w:p>
+    <w:p>
+      <w:pPr>
+        <w:pStyle w:val="Heading2"/>
+        <w:rPr/>
+      </w:pPr>
+      <w:r>
+        <w:rPr>
+          <w:rtl w:val="0"/>
+        </w:rPr>
+        <w:t>R3 Incorrect or incomplete profiles</w:t>
+      </w:r>
+    </w:p>
+    <w:p>
+      <w:pPr>
+        <w:spacing w:line="480" w:lineRule="auto"/>
+        <w:ind w:firstLine="720"/>
+        <w:rPr/>
+      </w:pPr>
+      <w:r>
+        <w:rPr>
+          <w:rtl w:val="0"/>
+        </w:rPr>
+        <w:t>Priority: 3 x 2 = 6 high. Owner: Ilnur Saipiyev. Self-reported skill levels and missing availability may generate misleading recommendations. Trigger: required profile fields are missing or users reject suggestions because the data is wrong.</w:t>
+      </w:r>
+    </w:p>
+    <w:p>
+      <w:pPr>
+        <w:spacing w:line="480" w:lineRule="auto"/>
+        <w:ind w:firstLine="720"/>
+        <w:rPr/>
+      </w:pPr>
+      <w:r>
+        <w:rPr>
+          <w:rtl w:val="0"/>
+        </w:rPr>
+        <w:t>Mitigation: Use controlled skill labels, explicit unknown values, required availability and a profile confirmation step. Explain which fields drive the suggestion.</w:t>
+      </w:r>
+    </w:p>
+    <w:p>
+      <w:pPr>
+        <w:spacing w:line="480" w:lineRule="auto"/>
+        <w:ind w:firstLine="720"/>
+        <w:rPr/>
+      </w:pPr>
+      <w:r>
+        <w:rPr>
+          <w:rtl w:val="0"/>
+        </w:rPr>
+        <w:t>Contingency: Exclude incomplete profiles from automatic allocation, request corrections and offer manual team discovery.</w:t>
+      </w:r>
+    </w:p>
+    <w:p>
+      <w:pPr>
+        <w:pStyle w:val="Heading2"/>
+        <w:rPr/>
+      </w:pPr>
+      <w:r>
+        <w:rPr>
+          <w:rtl w:val="0"/>
+        </w:rPr>
+        <w:t>R4 Poor matching outcomes or low trust</w:t>
+      </w:r>
+    </w:p>
+    <w:p>
+      <w:pPr>
+        <w:spacing w:line="480" w:lineRule="auto"/>
+        <w:ind w:firstLine="720"/>
+        <w:rPr/>
+      </w:pPr>
+      <w:r>
+        <w:rPr>
+          <w:rtl w:val="0"/>
+        </w:rPr>
+        <w:t>Priority: 2 x 3 = 6 high. Owner: Ilnur Saipiyev. Optimising one weighted score may leave weak teams or produce unwanted assignments. Trigger: low acceptance, reduced minimum role coverage or complaints about explanations.</w:t>
+      </w:r>
+    </w:p>
+    <w:p>
+      <w:pPr>
+        <w:spacing w:line="480" w:lineRule="auto"/>
+        <w:ind w:firstLine="720"/>
+        <w:rPr/>
+      </w:pPr>
+      <w:r>
+        <w:rPr>
+          <w:rtl w:val="0"/>
+        </w:rPr>
+        <w:t>Mitigation: Keep matching opt-in; expose reasons; compare minimum and mean coverage and acceptance against the baseline; test alternative weights.</w:t>
+      </w:r>
+    </w:p>
+    <w:p>
+      <w:pPr>
+        <w:spacing w:line="480" w:lineRule="auto"/>
+        <w:ind w:firstLine="720"/>
+        <w:rPr/>
+      </w:pPr>
+      <w:r>
+        <w:rPr>
+          <w:rtl w:val="0"/>
+        </w:rPr>
+        <w:t>Contingency: Revert to the baseline or organiser-assisted allocation; retain participant confirmation and reassignment.</w:t>
+      </w:r>
+    </w:p>
+    <w:p>
+      <w:pPr>
+        <w:pStyle w:val="Heading2"/>
+        <w:rPr/>
+      </w:pPr>
+      <w:r>
+        <w:rPr>
+          <w:rtl w:val="0"/>
+        </w:rPr>
+        <w:t>R5 Authorisation failure or data exposure</w:t>
+      </w:r>
+    </w:p>
+    <w:p>
+      <w:pPr>
+        <w:spacing w:line="480" w:lineRule="auto"/>
+        <w:ind w:firstLine="720"/>
+        <w:rPr/>
+      </w:pPr>
+      <w:r>
+        <w:rPr>
+          <w:rtl w:val="0"/>
+        </w:rPr>
+        <w:t>Priority: 2 x 3 = 6 high. Owner: Ilnur Saipiyev. Missing event-level checks may expose profiles or permit score and team changes by the wrong user. Trigger: a cross-role or cross-event negative test succeeds.</w:t>
+      </w:r>
+    </w:p>
+    <w:p>
+      <w:pPr>
+        <w:spacing w:line="480" w:lineRule="auto"/>
+        <w:ind w:firstLine="720"/>
+        <w:rPr/>
+      </w:pPr>
+      <w:r>
+        <w:rPr>
+          <w:rtl w:val="0"/>
+        </w:rPr>
+        <w:t>Mitigation: Enforce access checks on every endpoint; minimise public profile fields; test judge assignments; keep secrets outside Git.</w:t>
+      </w:r>
+    </w:p>
+    <w:p>
+      <w:pPr>
+        <w:spacing w:line="480" w:lineRule="auto"/>
+        <w:ind w:firstLine="720"/>
+        <w:rPr/>
+      </w:pPr>
+      <w:r>
+        <w:rPr>
+          <w:rtl w:val="0"/>
+        </w:rPr>
+        <w:t>Contingency: Block the affected endpoint, revoke exposed credentials when applicable, assess affected records and repair before reopening access.</w:t>
+      </w:r>
+    </w:p>
+    <w:p>
+      <w:pPr>
+        <w:pStyle w:val="Heading2"/>
+        <w:rPr/>
+      </w:pPr>
+      <w:r>
+        <w:rPr>
+          <w:rtl w:val="0"/>
+        </w:rPr>
+        <w:t>R6 Concurrent membership or deadline errors</w:t>
+      </w:r>
+    </w:p>
+    <w:p>
+      <w:pPr>
+        <w:spacing w:line="480" w:lineRule="auto"/>
+        <w:ind w:firstLine="720"/>
+        <w:rPr/>
+      </w:pPr>
+      <w:r>
+        <w:rPr>
+          <w:rtl w:val="0"/>
+        </w:rPr>
+        <w:t>Priority: 2 x 3 = 6 high. Owner: Ilnur Saipiyev. Simultaneous invitations or last-minute submissions may create duplicate membership, overfull teams or disputed deadlines. Trigger: a concurrency or deadline boundary test fails.</w:t>
+      </w:r>
+    </w:p>
+    <w:p>
+      <w:pPr>
+        <w:spacing w:line="480" w:lineRule="auto"/>
+        <w:ind w:firstLine="720"/>
+        <w:rPr/>
+      </w:pPr>
+      <w:r>
+        <w:rPr>
+          <w:rtl w:val="0"/>
+        </w:rPr>
+        <w:t>Mitigation: Use transactions and membership uniqueness rules, server-side time checks and repeatable integration tests. Display event timezone and submission confirmation.</w:t>
+      </w:r>
+    </w:p>
+    <w:p>
+      <w:pPr>
+        <w:spacing w:line="480" w:lineRule="auto"/>
+        <w:ind w:firstLine="720"/>
+        <w:rPr/>
+      </w:pPr>
+      <w:r>
+        <w:rPr>
+          <w:rtl w:val="0"/>
+        </w:rPr>
+        <w:t>Contingency: Suspend the affected workflow; reconcile records from the audit trail and backups; let the organiser resolve affected cases with a recorded decision.</w:t>
+      </w:r>
+    </w:p>
+    <w:p>
+      <w:pPr>
+        <w:pStyle w:val="Heading2"/>
+        <w:rPr/>
+      </w:pPr>
+      <w:r>
+        <w:rPr>
+          <w:rtl w:val="0"/>
+        </w:rPr>
+        <w:t>R7 Integration and schedule overrun</w:t>
+      </w:r>
+    </w:p>
+    <w:p>
+      <w:pPr>
+        <w:spacing w:line="480" w:lineRule="auto"/>
+        <w:ind w:firstLine="720"/>
+        <w:rPr/>
+      </w:pPr>
+      <w:r>
+        <w:rPr>
+          <w:rtl w:val="0"/>
+        </w:rPr>
+        <w:t>Priority: 3 x 2 = 6 high. Owner: Elkham Mamedov. A three-person team may lose time when frontend and backend contracts diverge or matching expands in scope. Trigger: a core milestone slips by more than one week or an API contract remains unresolved.</w:t>
+      </w:r>
+    </w:p>
+    <w:p>
+      <w:pPr>
+        <w:spacing w:line="480" w:lineRule="auto"/>
+        <w:ind w:firstLine="720"/>
+        <w:rPr/>
+      </w:pPr>
+      <w:r>
+        <w:rPr>
+          <w:rtl w:val="0"/>
+        </w:rPr>
+        <w:t>Mitigation: Agree versioned API contracts; integrate one end-to-end flow early; implement the baseline before optimisation; review dependencies weekly.</w:t>
+      </w:r>
+    </w:p>
+    <w:p>
+      <w:pPr>
+        <w:spacing w:line="480" w:lineRule="auto"/>
+        <w:ind w:firstLine="720"/>
+        <w:rPr/>
+      </w:pPr>
+      <w:r>
+        <w:rPr>
+          <w:rtl w:val="0"/>
+        </w:rPr>
+        <w:t>Contingency: Freeze optional features, deliver the core registration-to-submission flow and revise remaining milestones with the supervisor.</w:t>
+      </w:r>
+    </w:p>
+    <w:p>
+      <w:pPr>
+        <w:pStyle w:val="Heading2"/>
+        <w:rPr/>
+      </w:pPr>
+      <w:r>
+        <w:rPr>
+          <w:rtl w:val="0"/>
+        </w:rPr>
+        <w:t>R8 Deployment or database failure</w:t>
+      </w:r>
+    </w:p>
+    <w:p>
+      <w:pPr>
+        <w:spacing w:line="480" w:lineRule="auto"/>
+        <w:ind w:firstLine="720"/>
+        <w:rPr/>
+      </w:pPr>
+      <w:r>
+        <w:rPr>
+          <w:rtl w:val="0"/>
+        </w:rPr>
+        <w:t>Priority: 2 x 3 = 6 high. Owner: Ilnur Saipiyev. Hosting outages, failed migrations or missing backups may block the demonstration or lose submissions. Trigger: health checks fail, a migration fails or a backup cannot be restored.</w:t>
+      </w:r>
+    </w:p>
+    <w:p>
+      <w:pPr>
+        <w:spacing w:line="480" w:lineRule="auto"/>
+        <w:ind w:firstLine="720"/>
+        <w:rPr/>
+      </w:pPr>
+      <w:r>
+        <w:rPr>
+          <w:rtl w:val="0"/>
+        </w:rPr>
+        <w:t>Mitigation: Use a reproducible deployment, migration checks, health monitoring and database backups; rehearse a restore before the demonstration.</w:t>
+      </w:r>
+    </w:p>
+    <w:p>
+      <w:pPr>
+        <w:spacing w:line="480" w:lineRule="auto"/>
+        <w:ind w:firstLine="720"/>
+        <w:rPr/>
+      </w:pPr>
+      <w:r>
+        <w:rPr>
+          <w:rtl w:val="0"/>
+        </w:rPr>
+        <w:t>Contingency: Restore the last verified backup or run the prepared local demonstration with anonymised data; record the outage and verify integrity before resuming.</w:t>
+      </w:r>
+    </w:p>
+    <w:p>
+      <w:pPr>
+        <w:pStyle w:val="Heading2"/>
+        <w:rPr/>
+      </w:pPr>
+      <w:r>
+        <w:rPr>
+          <w:rtl w:val="0"/>
+        </w:rPr>
+        <w:t>Milestones</w:t>
+      </w:r>
+    </w:p>
+    <w:p>
+      <w:pPr>
+        <w:spacing w:line="480" w:lineRule="auto"/>
+        <w:ind w:firstLine="720"/>
+        <w:rPr/>
+      </w:pPr>
+      <w:r>
+        <w:rPr>
+          <w:rtl w:val="0"/>
+        </w:rPr>
+        <w:t>The project proceeds through four milestones: validated requirements and user evidence; architecture, API contracts and interface design; an integrated registration-to-submission workflow with baseline matching; and evaluation, defect correction and release preparation. Dependencies include access to user representatives, consented profile data, an available deployment environment and supervisor review.</w:t>
       </w:r>
     </w:p>
     <w:p>
@@ -9613,13 +10627,12 @@
         <w:rPr>
           <w:rtl w:val="0"/>
         </w:rPr>
-        <w:t xml:space="preserve">Supervisor feedback has not yet been provided. This section will be updated with real feedback before submission</w:t>
-      </w:r>
-      <w:r>
-        <w:rPr>
-          <w:rtl w:val="0"/>
-        </w:rPr>
-        <w:t xml:space="preserve">.</w:t>
+        <w:t>No supervisor feedback was available at the time of this report.</w:t>
+      </w:r>
+      <w:r>
+        <w:rPr>
+          <w:rtl w:val="0"/>
+        </w:rPr>
       </w:r>
     </w:p>
     <w:p>
@@ -9661,7 +10674,7 @@
         <w:rPr>
           <w:rtl w:val="0"/>
         </w:rPr>
-        <w:t xml:space="preserve">, 1–6.</w:t>
+        <w:t xml:space="preserve">, 1-6.</w:t>
       </w:r>
       <w:hyperlink r:id="rId6">
         <w:r>
@@ -9713,7 +10726,7 @@
         <w:rPr>
           <w:rtl w:val="0"/>
         </w:rPr>
-        <w:t xml:space="preserve">, 217–276.</w:t>
+        <w:t xml:space="preserve">, 217-276.</w:t>
       </w:r>
       <w:hyperlink r:id="rId8">
         <w:r>
@@ -9765,7 +10778,7 @@
         <w:rPr>
           <w:rtl w:val="0"/>
         </w:rPr>
-        <w:t xml:space="preserve">, (44), 21–41.</w:t>
+        <w:t xml:space="preserve">, (44), 21-41.</w:t>
       </w:r>
       <w:hyperlink r:id="rId10">
         <w:r>
@@ -9801,7 +10814,7 @@
         <w:rPr>
           <w:rtl w:val="0"/>
         </w:rPr>
-        <w:t xml:space="preserve">Hastings, E. M., Ojha, V., Austriaco, B. V., Karahalios, K., &amp; Bailey, B. P. (2023). Composing team compositions: An examination of instructors’ current algorithmic team formation practices. </w:t>
+        <w:t xml:space="preserve">Hastings, E. M., Ojha, V., Austriaco, B. V., Karahalios, K., &amp; Bailey, B. P. (2023). Composing team compositions: An examination of instructors' current algorithmic team formation practices. </w:t>
       </w:r>
       <w:r>
         <w:rPr>
@@ -9894,7 +10907,7 @@
         <w:rPr>
           <w:rtl w:val="0"/>
         </w:rPr>
-        <w:t xml:space="preserve">(2), 232–243. </w:t>
+        <w:t xml:space="preserve">(2), 232-243. </w:t>
       </w:r>
       <w:hyperlink r:id="rId14">
         <w:r>
@@ -10002,7 +11015,7 @@
         <w:rPr>
           <w:rtl w:val="0"/>
         </w:rPr>
-        <w:t xml:space="preserve"> (Vol. 1, pp. 11–17). Association for Computing Machinery.</w:t>
+        <w:t xml:space="preserve"> (Vol. 1, pp. 11-17). Association for Computing Machinery.</w:t>
       </w:r>
       <w:hyperlink r:id="rId17">
         <w:r>
@@ -10067,7 +11080,7 @@
         <w:rPr>
           <w:rtl w:val="0"/>
         </w:rPr>
-        <w:t xml:space="preserve">(CSCW2), Article 330, 1–32.</w:t>
+        <w:t xml:space="preserve">(CSCW2), Article 330, 1-32.</w:t>
       </w:r>
       <w:hyperlink r:id="rId19">
         <w:r>
@@ -10134,7 +11147,7 @@
         <w:rPr>
           <w:rtl w:val="0"/>
         </w:rPr>
-        <w:t xml:space="preserve">, 72–84.</w:t>
+        <w:t xml:space="preserve">, 72-84.</w:t>
       </w:r>
       <w:hyperlink r:id="rId21">
         <w:r>
@@ -10224,13 +11237,13 @@
           <w:iCs w:val="1"/>
           <w:rtl w:val="0"/>
         </w:rPr>
-        <w:t xml:space="preserve">Proceedings of the 3rd International Conference on Educational Digitalization and Computer Science in the Guangdong-Hong Kong-Macao Greater Bay Area, EDCS ’26</w:t>
-      </w:r>
-      <w:r>
-        <w:rPr>
-          <w:rtl w:val="0"/>
-        </w:rPr>
-        <w:t xml:space="preserve">, 1326–1331.</w:t>
+        <w:t xml:space="preserve">Proceedings of the 3rd International Conference on Educational Digitalization and Computer Science in the Guangdong-Hong Kong-Macao Greater Bay Area, EDCS '26</w:t>
+      </w:r>
+      <w:r>
+        <w:rPr>
+          <w:rtl w:val="0"/>
+        </w:rPr>
+        <w:t xml:space="preserve">, 1326-1331.</w:t>
       </w:r>
       <w:hyperlink r:id="rId24">
         <w:r>
@@ -10274,13 +11287,13 @@
           <w:iCs w:val="1"/>
           <w:rtl w:val="0"/>
         </w:rPr>
-        <w:t xml:space="preserve">Proceedings of the 2026 International Conference on Big Data and Informatization Education, ICBDIE ’26</w:t>
-      </w:r>
-      <w:r>
-        <w:rPr>
-          <w:rtl w:val="0"/>
-        </w:rPr>
-        <w:t xml:space="preserve">, 512–517.</w:t>
+        <w:t xml:space="preserve">Proceedings of the 2026 International Conference on Big Data and Informatization Education, ICBDIE '26</w:t>
+      </w:r>
+      <w:r>
+        <w:rPr>
+          <w:rtl w:val="0"/>
+        </w:rPr>
+        <w:t xml:space="preserve">, 512-517.</w:t>
       </w:r>
       <w:hyperlink r:id="rId26">
         <w:r>

</xml_diff>

<commit_message>
Update report with UX prototype
</commit_message>
<xml_diff>
--- a/docs/report.docx
+++ b/docs/report.docx
@@ -3205,7 +3205,7 @@
         <w:rPr>
           <w:rtl w:val="0"/>
         </w:rPr>
-        <w:t>Method and setting. The authors trialled opt-in software matching in an introductory engineering and computer science course with more than 1,000 students during remote teaching. Students could request reassignment. Results. Underrepresented students were more likely to request matching; matched students reported comparable group experiences across backgrounds, and positive group experiences were associated with exam outcomes. Limitation. This was a course deployment, not a randomised student hackathon experiment; the associations do not prove a causal benefit of our proposed algorithm. Design implication. Preserve voluntary participation, reassignment and separate measures of comfort and activity.</w:t>
+        <w:t>Method and setting. The authors trialled opt-in software matching in an introductory engineering and computer science course with more than 1,000 students during remote teaching. Students could request reassignment. Results. Underrepresented students were more likely to request matching; matched students reported comparable group experiences across backgrounds, and positive group experiences were associated with exam outcomes. Limitation. This was a course deployment, not a randomised student hackathon experiment; the associations do not prove a causal benefit of our proposed algorithm. The findings support voluntary participation, reassignment and separate measures of comfort and activity in HackMatch.</w:t>
       </w:r>
     </w:p>
     <w:p>
@@ -3230,7 +3230,7 @@
         <w:rPr>
           <w:rtl w:val="0"/>
         </w:rPr>
-        <w:t>Method and sample. A multiple-case study examined 10 teams across four online hackathons on two continents, using 27 interviews. Results. Teams combined synchronous and asynchronous tools; responsibilities were often self-selected by skill or interest. Networking and informal mentor access decreased, while multiple tools created technical and information burdens. Limitation. This observational qualitative study did not compare matching algorithms or quantify a causal effect of a central platform. Design implication. Centralise event information and submissions, make roles visible and test the complete workflow.</w:t>
+        <w:t>Method and sample. A multiple-case study examined 10 teams across four online hackathons on two continents, using 27 interviews. Results. Teams combined synchronous and asynchronous tools; responsibilities were often self-selected by skill or interest. Networking and informal mentor access decreased, while multiple tools created technical and information burdens. Limitation. This observational qualitative study did not compare matching algorithms or quantify a causal effect of a central platform. These findings inform the central event workflow, visible team roles and end-to-end evaluation in HackMatch.</w:t>
       </w:r>
     </w:p>
     <w:p>
@@ -3255,7 +3255,7 @@
         <w:rPr>
           <w:rtl w:val="0"/>
         </w:rPr>
-        <w:t>Method and sample. The researchers surveyed 77 instructors and conducted 21 follow-up interviews about criteria-based grouping, including CATME. Results. Instructors checked proposed teams against educational goals but sometimes struggled to translate those goals into tool settings. Student input was often absent. Limitation. The work describes instructor practice rather than experimentally proving higher team performance. Design implication. Display matching criteria, allow organiser review and collect participant feedback.</w:t>
+        <w:t>Method and sample. The researchers surveyed 77 instructors and conducted 21 follow-up interviews about criteria-based grouping, including CATME. Results. Instructors checked proposed teams against educational goals but sometimes struggled to translate those goals into tool settings. Student input was often absent. Limitation. The work describes instructor practice rather than experimentally proving higher team performance. These findings support visible matching criteria, organiser review and participant feedback in HackMatch.</w:t>
       </w:r>
     </w:p>
     <w:p>
@@ -3280,7 +3280,7 @@
         <w:rPr>
           <w:rtl w:val="0"/>
         </w:rPr>
-        <w:t>Method. The authors simulated bottom-up, top-down and hybrid team formation. Results. Self-organisation favoured the strongest teams, while the hybrid model better protected the weakest teams; mean quality did not differ significantly across models. Limitation. Outcomes were generated by an agent model and its assumptions, not observed in a live hackathon. Design implication. Compare minimum and average role coverage and unassigned participants, rather than reporting only the best team.</w:t>
+        <w:t>Method. The authors simulated bottom-up, top-down and hybrid team formation. Results. Self-organisation favoured the strongest teams, while the hybrid model better protected the weakest teams; mean quality did not differ significantly across models. Limitation. Outcomes were generated by an agent model and its assumptions, not observed in a live hackathon. The HackMatch evaluation therefore includes minimum and average role coverage and unassigned participants, alongside the strongest team outcomes.</w:t>
       </w:r>
     </w:p>
     <w:p>
@@ -9516,6 +9516,21 @@
     </w:p>
     <w:p>
       <w:pPr>
+        <w:keepNext/>
+        <w:spacing w:line="480" w:lineRule="auto"/>
+        <w:ind w:firstLine="720"/>
+        <w:rPr/>
+      </w:pPr>
+      <w:r>
+        <w:rPr>
+          <w:rtl w:val="0"/>
+        </w:rPr>
+        <w:t>Participants provide profiles, registrations and project URLs. Organisers configure events and team constraints. Judges access assigned submissions and enter scores. GitHub and demo pages are external link destinations; the system stores URLs and does not execute submitted code.</w:t>
+      </w:r>
+    </w:p>
+    <w:p>
+      <w:pPr>
+        <w:keepNext w:val="0"/>
         <w:spacing w:line="480" w:lineRule="auto"/>
         <w:ind w:firstLine="0"/>
         <w:rPr/>
@@ -9562,6 +9577,19 @@
     </w:p>
     <w:p>
       <w:pPr>
+        <w:pStyle w:val="Heading2"/>
+        <w:rPr/>
+      </w:pPr>
+      <w:r>
+        <w:rPr>
+          <w:rtl w:val="0"/>
+        </w:rPr>
+        <w:t>Use Case Diagram</w:t>
+      </w:r>
+    </w:p>
+    <w:p>
+      <w:pPr>
+        <w:keepNext/>
         <w:spacing w:line="480" w:lineRule="auto"/>
         <w:ind w:firstLine="720"/>
         <w:rPr/>
@@ -9570,23 +9598,12 @@
         <w:rPr>
           <w:rtl w:val="0"/>
         </w:rPr>
-        <w:t>Participants provide profiles, registrations and project URLs. Organisers configure events and team constraints. Judges access assigned submissions and enter scores. GitHub and demo pages are external link destinations; the system stores URLs and does not execute submitted code.</w:t>
-      </w:r>
-    </w:p>
-    <w:p>
-      <w:pPr>
-        <w:pStyle w:val="Heading2"/>
-        <w:rPr/>
-      </w:pPr>
-      <w:r>
-        <w:rPr>
-          <w:rtl w:val="0"/>
-        </w:rPr>
-        <w:t>Use Case Diagram</w:t>
-      </w:r>
-    </w:p>
-    <w:p>
-      <w:pPr>
+        <w:t>The diagram shows participant, organiser and judge actions. FR-01 to FR-08 refer to the requirements in Section 6. Login is shared, and protected operations enforce both role and event permissions. Event review and announcements support the event management scope.</w:t>
+      </w:r>
+    </w:p>
+    <w:p>
+      <w:pPr>
+        <w:keepNext w:val="0"/>
         <w:spacing w:line="480" w:lineRule="auto"/>
         <w:ind w:firstLine="0"/>
         <w:rPr/>
@@ -9633,6 +9650,19 @@
     </w:p>
     <w:p>
       <w:pPr>
+        <w:pStyle w:val="Heading2"/>
+        <w:rPr/>
+      </w:pPr>
+      <w:r>
+        <w:rPr>
+          <w:rtl w:val="0"/>
+        </w:rPr>
+        <w:t>Component Diagram draft</w:t>
+      </w:r>
+    </w:p>
+    <w:p>
+      <w:pPr>
+        <w:keepNext/>
         <w:spacing w:line="480" w:lineRule="auto"/>
         <w:ind w:firstLine="720"/>
         <w:rPr/>
@@ -9641,23 +9671,12 @@
         <w:rPr>
           <w:rtl w:val="0"/>
         </w:rPr>
-        <w:t>The diagram shows participant, organiser and judge actions. FR-01 to FR-08 refer to the requirements in Section 6. Login is shared, and protected operations enforce both role and event permissions. Event review and announcements support the event management scope.</w:t>
-      </w:r>
-    </w:p>
-    <w:p>
-      <w:pPr>
-        <w:pStyle w:val="Heading2"/>
-        <w:rPr/>
-      </w:pPr>
-      <w:r>
-        <w:rPr>
-          <w:rtl w:val="0"/>
-        </w:rPr>
-        <w:t>Component Diagram draft</w:t>
-      </w:r>
-    </w:p>
-    <w:p>
-      <w:pPr>
+        <w:t>The API validates requests and enforces permissions before invoking domain modules. Matching reads profiles and event constraints and returns suggestions with explanations. Team management applies accepted changes. The data access layer uses transactions to prevent duplicate membership and overfull teams.</w:t>
+      </w:r>
+    </w:p>
+    <w:p>
+      <w:pPr>
+        <w:keepNext w:val="0"/>
         <w:spacing w:line="480" w:lineRule="auto"/>
         <w:ind w:firstLine="0"/>
         <w:rPr/>
@@ -9712,7 +9731,21 @@
         <w:rPr>
           <w:rtl w:val="0"/>
         </w:rPr>
-        <w:t>The API validates requests and enforces permissions before invoking domain modules. Matching reads profiles and event constraints and returns suggestions with explanations. Team management applies accepted changes. The data access layer uses transactions to prevent duplicate membership and overfull teams.</w:t>
+        <w:t>Alignment. FR-01 and FR-02 map to event and registration management; FR-03 to profiles; FR-04 and NFR-03 to matching and explanations; FR-05 and FR-06 to invitations and team management; FR-07 and FR-08 to submissions and judging. NFR-01 is enforced by access control, and NFR-02 by responsive frontend pages. Stored entities include users, events, registrations, profiles, teams, memberships, invitations, announcements, submissions and scores.</w:t>
+      </w:r>
+    </w:p>
+    <w:p>
+      <w:pPr>
+        <w:pStyle w:val="Heading1"/>
+        <w:rPr/>
+      </w:pPr>
+      <w:bookmarkStart w:colFirst="0" w:colLast="0" w:name="_dm8djwapsqe6" w:id="17"/>
+      <w:bookmarkEnd w:id="17"/>
+      <w:r>
+        <w:rPr>
+          <w:rtl w:val="0"/>
+        </w:rPr>
+        <w:t xml:space="preserve">8. UX / Prototype</w:t>
       </w:r>
     </w:p>
     <w:p>
@@ -9725,190 +9758,512 @@
         <w:rPr>
           <w:rtl w:val="0"/>
         </w:rPr>
-        <w:t>Alignment. FR-01 and FR-02 map to event and registration management; FR-03 to profiles; FR-04 and NFR-03 to matching and explanations; FR-05 and FR-06 to invitations and team management; FR-07 and FR-08 to submissions and judging. NFR-01 is enforced by access control, and NFR-02 by responsive frontend pages. Stored entities include users, events, registrations, profiles, teams, memberships, invitations, announcements, submissions and scores.</w:t>
-      </w:r>
-    </w:p>
-    <w:p>
-      <w:pPr>
-        <w:pStyle w:val="Heading1"/>
-        <w:rPr/>
-      </w:pPr>
-      <w:bookmarkStart w:colFirst="0" w:colLast="0" w:name="_dm8djwapsqe6" w:id="17"/>
-      <w:bookmarkEnd w:id="17"/>
-      <w:r>
-        <w:rPr>
-          <w:rtl w:val="0"/>
-        </w:rPr>
-        <w:t xml:space="preserve">8. UX / Prototype</w:t>
-      </w:r>
-    </w:p>
-    <w:p>
-      <w:pPr>
-        <w:spacing w:after="240" w:before="240" w:lineRule="auto"/>
-        <w:rPr/>
-      </w:pPr>
-      <w:r>
-        <w:rPr>
-          <w:rtl w:val="0"/>
-        </w:rPr>
-        <w:t xml:space="preserve">The prototype will be a clickable set of interface sketches made in Figma before the front-end is implemented. It will show the main screens for the three roles and the navigation between them, and it will be used to discuss the interface with the supervisor and to prepare usability test tasks. Every screen will be designed for two widths, 375 px (phone) and 1280 px (desktop), in line with NFR-02. The style will be simple and consistent: a top navigation bar, cards for events and teams, clear forms with inline validation messages and one primary action on each screen.</w:t>
-      </w:r>
-    </w:p>
-    <w:p>
-      <w:pPr>
-        <w:spacing w:after="240" w:before="240" w:lineRule="auto"/>
-        <w:rPr/>
-      </w:pPr>
-      <w:r>
-        <w:rPr>
-          <w:i w:val="1"/>
-          <w:iCs w:val="1"/>
-          <w:rtl w:val="0"/>
-        </w:rPr>
-        <w:t xml:space="preserve">Registration and login.</w:t>
-      </w:r>
-      <w:r>
-        <w:rPr>
-          <w:rtl w:val="0"/>
-        </w:rPr>
-        <w:t xml:space="preserve"> Two simple forms with email, password and, for registration, full name and role. Errors such as a wrong password or an already used email appear directly under the field.</w:t>
-      </w:r>
-    </w:p>
-    <w:p>
-      <w:pPr>
-        <w:spacing w:after="240" w:before="240" w:lineRule="auto"/>
-        <w:rPr/>
-      </w:pPr>
-      <w:r>
-        <w:rPr>
-          <w:i w:val="1"/>
-          <w:iCs w:val="1"/>
-          <w:rtl w:val="0"/>
-        </w:rPr>
-        <w:t xml:space="preserve">Participant profile.</w:t>
-      </w:r>
-      <w:r>
-        <w:rPr>
-          <w:rtl w:val="0"/>
-        </w:rPr>
-        <w:t xml:space="preserve"> A form where the student selects skills, experience level, preferred roles and interests and adds availability. A short summary card on the side shows how the profile looks to the matching module. Saved values stay after logging in again (FR-03).</w:t>
-      </w:r>
-    </w:p>
-    <w:p>
-      <w:pPr>
-        <w:spacing w:after="240" w:before="240" w:lineRule="auto"/>
-        <w:rPr/>
-      </w:pPr>
-      <w:r>
-        <w:rPr>
-          <w:i w:val="1"/>
-          <w:iCs w:val="1"/>
-          <w:rtl w:val="0"/>
-        </w:rPr>
-        <w:t xml:space="preserve">Events list and event page.</w:t>
-      </w:r>
-      <w:r>
-        <w:rPr>
-          <w:rtl w:val="0"/>
-        </w:rPr>
-        <w:t xml:space="preserve"> A list of cards with the event title, dates and status, and a detail page with rules, tracks, team size limits and announcements. A single "Register" button confirms the registration, and a duplicate attempt shows a clear message (FR-02).</w:t>
-      </w:r>
-    </w:p>
-    <w:p>
-      <w:pPr>
-        <w:spacing w:after="240" w:before="240" w:lineRule="auto"/>
-        <w:rPr/>
-      </w:pPr>
-      <w:r>
-        <w:rPr>
-          <w:i w:val="1"/>
-          <w:iCs w:val="1"/>
-          <w:rtl w:val="0"/>
-        </w:rPr>
-        <w:t xml:space="preserve">Team suggestions.</w:t>
-      </w:r>
-      <w:r>
-        <w:rPr>
-          <w:rtl w:val="0"/>
-        </w:rPr>
-        <w:t xml:space="preserve"> The key screen for participants. It shows one or several suggested teams as cards with the members, their roles and a match indicator. Each suggestion includes a short explanation of the criteria used, for example complementary skills and role coverage (NFR-03). The student can confirm or decline the invitation with two buttons, and the team status updates immediately (FR-05). If no feasible team exists, the screen shows a clear warning instead of an invalid team.</w:t>
-      </w:r>
-    </w:p>
-    <w:p>
-      <w:pPr>
-        <w:spacing w:after="240" w:before="240" w:lineRule="auto"/>
-        <w:rPr/>
-      </w:pPr>
-      <w:r>
-        <w:rPr>
-          <w:i w:val="1"/>
-          <w:iCs w:val="1"/>
-          <w:rtl w:val="0"/>
-        </w:rPr>
-        <w:t xml:space="preserve">Organiser dashboard.</w:t>
-      </w:r>
-      <w:r>
-        <w:rPr>
-          <w:rtl w:val="0"/>
-        </w:rPr>
-        <w:t xml:space="preserve"> A page with tabs for registrations, teams, announcements and results. The registrations tab shows a table of participants with filters by skills and roles. A "Form teams" button starts the matching, and the teams tab shows the result as cards with warnings for teams that break the constraints. The organiser can move a participant between teams by selecting a new team, and the system checks the size limits before saving (FR-06). The same dashboard allows creating and editing events (FR-01) and publishing announcements.</w:t>
-      </w:r>
-    </w:p>
-    <w:p>
-      <w:pPr>
-        <w:spacing w:after="240" w:before="240" w:lineRule="auto"/>
-        <w:rPr/>
-      </w:pPr>
-      <w:r>
-        <w:rPr>
-          <w:i w:val="1"/>
-          <w:iCs w:val="1"/>
-          <w:rtl w:val="0"/>
-        </w:rPr>
-        <w:t xml:space="preserve">Project submission.</w:t>
-      </w:r>
-      <w:r>
-        <w:rPr>
-          <w:rtl w:val="0"/>
-        </w:rPr>
-        <w:t xml:space="preserve"> A short form where a team enters the repository and demo links before the deadline, with a countdown and a confirmation after saving (FR-07).</w:t>
-      </w:r>
-    </w:p>
-    <w:p>
-      <w:pPr>
-        <w:spacing w:after="240" w:before="240" w:lineRule="auto"/>
-        <w:rPr/>
-      </w:pPr>
-      <w:r>
-        <w:rPr>
-          <w:i w:val="1"/>
-          <w:iCs w:val="1"/>
-          <w:rtl w:val="0"/>
-        </w:rPr>
-        <w:t xml:space="preserve">Judging and results.</w:t>
-      </w:r>
-      <w:r>
-        <w:rPr>
-          <w:rtl w:val="0"/>
-        </w:rPr>
-        <w:t xml:space="preserve"> The judge sees a list of assigned projects and a scoring sheet with rubric criteria and a comment field. The organiser sees the submitted scores and a leaderboard table (FR-08).</w:t>
-      </w:r>
-    </w:p>
-    <w:p>
-      <w:pPr>
-        <w:spacing w:after="240" w:before="240" w:lineRule="auto"/>
-        <w:rPr/>
-      </w:pPr>
-      <w:r>
-        <w:rPr>
-          <w:rtl w:val="0"/>
-        </w:rPr>
-        <w:t xml:space="preserve">The main user flows to be demonstrated in the prototype are: an organiser creates an event and runs team formation; a participant registers, fills in a profile, reviews suggestions and confirms a team; a team submits a project and a judge scores it. The prototype will be linked to Section 6 by requirement IDs and will serve as the basis for the task-based usability testing described in Section 9.</w:t>
-      </w:r>
-      <w:r>
-        <w:rPr>
-          <w:rtl w:val="0"/>
-        </w:rPr>
+        <w:t>The HackMatch interface prototype presents desktop and mobile layouts for participants, organisers and judges. The main participant scenario is account creation, profile setup, event discovery, review of explained team suggestions and confirmation or rejection of an invitation. The organiser reviews team composition and can reassign participants; the judge evaluates assigned projects using a shared rubric. The mockups use sample data and illustrative matching explanations.</w:t>
+      </w:r>
+    </w:p>
+    <w:p>
+      <w:pPr>
+        <w:spacing w:line="480" w:lineRule="auto"/>
+        <w:ind w:firstLine="720"/>
+        <w:rPr/>
+      </w:pPr>
+      <w:r>
+        <w:rPr>
+          <w:rtl w:val="0"/>
+        </w:rPr>
+        <w:t xml:space="preserve">Figma prototype: </w:t>
+      </w:r>
+      <w:hyperlink r:id="rId42">
+        <w:r>
+          <w:rPr>
+            <w:color w:val="000000"/>
+            <w:u w:val="single"/>
+          </w:rPr>
+          <w:t>HackMatch UI/UX proto</w:t>
+        </w:r>
+      </w:hyperlink>
+    </w:p>
+    <w:p>
+      <w:pPr>
+        <w:pStyle w:val="Heading2"/>
+        <w:keepNext/>
+        <w:rPr/>
+      </w:pPr>
+      <w:r>
+        <w:rPr>
+          <w:rtl w:val="0"/>
+        </w:rPr>
+        <w:t>8.1 Login</w:t>
+      </w:r>
+    </w:p>
+    <w:p>
+      <w:pPr>
+        <w:keepNext/>
+        <w:spacing w:line="480" w:lineRule="auto"/>
+        <w:ind w:firstLine="720"/>
+        <w:rPr/>
+      </w:pPr>
+      <w:r>
+        <w:rPr>
+          <w:rtl w:val="0"/>
+        </w:rPr>
+        <w:t>Participants, organisers and judges use a shared login screen. The interface provides university email and password fields, password visibility, account recovery and access to registration. The assigned role determines the workspace displayed after authentication (NFR-01).</w:t>
+      </w:r>
+    </w:p>
+    <w:p>
+      <w:pPr>
+        <w:keepNext w:val="0"/>
+        <w:spacing w:line="480" w:lineRule="auto" w:after="0"/>
+        <w:ind w:firstLine="0"/>
+        <w:rPr/>
+      </w:pPr>
+      <w:r>
+        <w:drawing>
+          <wp:inline>
+            <wp:extent cx="5943600" cy="2725195"/>
+            <wp:docPr id="4" name="Picture 4"/>
+            <wp:cNvGraphicFramePr>
+              <a:graphicFrameLocks noChangeAspect="1"/>
+            </wp:cNvGraphicFramePr>
+            <a:graphic>
+              <a:graphicData uri="http://schemas.openxmlformats.org/drawingml/2006/picture">
+                <pic:pic>
+                  <pic:nvPicPr>
+                    <pic:cNvPr id="0" name="Снимок экрана 2026-10-30 в 19.09.50.png"/>
+                    <pic:cNvPicPr/>
+                  </pic:nvPicPr>
+                  <pic:blipFill>
+                    <a:blip r:embed="rId43"/>
+                    <a:stretch>
+                      <a:fillRect/>
+                    </a:stretch>
+                  </pic:blipFill>
+                  <pic:spPr>
+                    <a:xfrm>
+                      <a:off x="0" y="0"/>
+                      <a:ext cx="5943600" cy="2725195"/>
+                    </a:xfrm>
+                    <a:prstGeom prst="rect"/>
+                  </pic:spPr>
+                </pic:pic>
+              </a:graphicData>
+            </a:graphic>
+          </wp:inline>
+        </w:drawing>
+      </w:r>
+    </w:p>
+    <w:p>
+      <w:pPr>
+        <w:pStyle w:val="Heading2"/>
+        <w:keepNext/>
+        <w:rPr/>
+      </w:pPr>
+      <w:r>
+        <w:rPr>
+          <w:rtl w:val="0"/>
+        </w:rPr>
+        <w:t>8.2 Account registration</w:t>
+      </w:r>
+    </w:p>
+    <w:p>
+      <w:pPr>
+        <w:keepNext/>
+        <w:spacing w:line="480" w:lineRule="auto"/>
+        <w:ind w:firstLine="720"/>
+        <w:rPr/>
+      </w:pPr>
+      <w:r>
+        <w:rPr>
+          <w:rtl w:val="0"/>
+        </w:rPr>
+        <w:t>The registration form collects a full name, university email, password and password confirmation. Account creation is separate from registration for a particular hackathon. The role selector illustrates the available workspaces; organiser and judge access requires server-side authorisation (NFR-01).</w:t>
+      </w:r>
+    </w:p>
+    <w:p>
+      <w:pPr>
+        <w:keepNext w:val="0"/>
+        <w:spacing w:line="480" w:lineRule="auto" w:after="0"/>
+        <w:ind w:firstLine="0"/>
+        <w:rPr/>
+      </w:pPr>
+      <w:r>
+        <w:drawing>
+          <wp:inline>
+            <wp:extent cx="5943600" cy="2712291"/>
+            <wp:docPr id="5" name="Picture 5"/>
+            <wp:cNvGraphicFramePr>
+              <a:graphicFrameLocks noChangeAspect="1"/>
+            </wp:cNvGraphicFramePr>
+            <a:graphic>
+              <a:graphicData uri="http://schemas.openxmlformats.org/drawingml/2006/picture">
+                <pic:pic>
+                  <pic:nvPicPr>
+                    <pic:cNvPr id="0" name="Снимок экрана 2026-10-30 в 19.09.56.png"/>
+                    <pic:cNvPicPr/>
+                  </pic:nvPicPr>
+                  <pic:blipFill>
+                    <a:blip r:embed="rId44"/>
+                    <a:stretch>
+                      <a:fillRect/>
+                    </a:stretch>
+                  </pic:blipFill>
+                  <pic:spPr>
+                    <a:xfrm>
+                      <a:off x="0" y="0"/>
+                      <a:ext cx="5943600" cy="2712291"/>
+                    </a:xfrm>
+                    <a:prstGeom prst="rect"/>
+                  </pic:spPr>
+                </pic:pic>
+              </a:graphicData>
+            </a:graphic>
+          </wp:inline>
+        </w:drawing>
+      </w:r>
+    </w:p>
+    <w:p>
+      <w:pPr>
+        <w:pStyle w:val="Heading2"/>
+        <w:keepNext/>
+        <w:rPr/>
+      </w:pPr>
+      <w:r>
+        <w:rPr>
+          <w:rtl w:val="0"/>
+        </w:rPr>
+        <w:t>8.3 Participant profile</w:t>
+      </w:r>
+    </w:p>
+    <w:p>
+      <w:pPr>
+        <w:keepNext/>
+        <w:spacing w:line="480" w:lineRule="auto"/>
+        <w:ind w:firstLine="720"/>
+        <w:rPr/>
+      </w:pPr>
+      <w:r>
+        <w:rPr>
+          <w:rtl w:val="0"/>
+        </w:rPr>
+        <w:t>The profile screen collects skills, experience level, preferred roles, project interests and availability. A summary explains how these attributes inform teammate suggestions. Desktop and mobile layouts present the same profile fields and a save action (FR-03, NFR-02).</w:t>
+      </w:r>
+    </w:p>
+    <w:p>
+      <w:pPr>
+        <w:keepNext w:val="0"/>
+        <w:spacing w:line="480" w:lineRule="auto" w:after="0"/>
+        <w:ind w:firstLine="0"/>
+        <w:rPr/>
+      </w:pPr>
+      <w:r>
+        <w:drawing>
+          <wp:inline>
+            <wp:extent cx="5943600" cy="2745776"/>
+            <wp:docPr id="6" name="Picture 6"/>
+            <wp:cNvGraphicFramePr>
+              <a:graphicFrameLocks noChangeAspect="1"/>
+            </wp:cNvGraphicFramePr>
+            <a:graphic>
+              <a:graphicData uri="http://schemas.openxmlformats.org/drawingml/2006/picture">
+                <pic:pic>
+                  <pic:nvPicPr>
+                    <pic:cNvPr id="0" name="Снимок экрана 2026-10-30 в 19.10.05.png"/>
+                    <pic:cNvPicPr/>
+                  </pic:nvPicPr>
+                  <pic:blipFill>
+                    <a:blip r:embed="rId45"/>
+                    <a:stretch>
+                      <a:fillRect/>
+                    </a:stretch>
+                  </pic:blipFill>
+                  <pic:spPr>
+                    <a:xfrm>
+                      <a:off x="0" y="0"/>
+                      <a:ext cx="5943600" cy="2745776"/>
+                    </a:xfrm>
+                    <a:prstGeom prst="rect"/>
+                  </pic:spPr>
+                </pic:pic>
+              </a:graphicData>
+            </a:graphic>
+          </wp:inline>
+        </w:drawing>
+      </w:r>
+    </w:p>
+    <w:p>
+      <w:pPr>
+        <w:pStyle w:val="Heading2"/>
+        <w:keepNext/>
+        <w:rPr/>
+      </w:pPr>
+      <w:r>
+        <w:rPr>
+          <w:rtl w:val="0"/>
+        </w:rPr>
+        <w:t>8.4 Hackathon discovery</w:t>
+      </w:r>
+    </w:p>
+    <w:p>
+      <w:pPr>
+        <w:keepNext/>
+        <w:spacing w:line="480" w:lineRule="auto"/>
+        <w:ind w:firstLine="720"/>
+        <w:rPr/>
+      </w:pPr>
+      <w:r>
+        <w:rPr>
+          <w:rtl w:val="0"/>
+        </w:rPr>
+        <w:t>Participants search events by title or track and filter them by status. Event cards show dates, location or format, a short description and relevant tracks. Opening an event is the entry point to reviewing its rules and registering for participation (FR-02, NFR-02).</w:t>
+      </w:r>
+    </w:p>
+    <w:p>
+      <w:pPr>
+        <w:keepNext w:val="0"/>
+        <w:spacing w:line="480" w:lineRule="auto" w:after="0"/>
+        <w:ind w:firstLine="0"/>
+        <w:rPr/>
+      </w:pPr>
+      <w:r>
+        <w:drawing>
+          <wp:inline>
+            <wp:extent cx="5943600" cy="2807868"/>
+            <wp:docPr id="7" name="Picture 7"/>
+            <wp:cNvGraphicFramePr>
+              <a:graphicFrameLocks noChangeAspect="1"/>
+            </wp:cNvGraphicFramePr>
+            <a:graphic>
+              <a:graphicData uri="http://schemas.openxmlformats.org/drawingml/2006/picture">
+                <pic:pic>
+                  <pic:nvPicPr>
+                    <pic:cNvPr id="0" name="Снимок экрана 2026-10-30 в 19.10.12.png"/>
+                    <pic:cNvPicPr/>
+                  </pic:nvPicPr>
+                  <pic:blipFill>
+                    <a:blip r:embed="rId46"/>
+                    <a:stretch>
+                      <a:fillRect/>
+                    </a:stretch>
+                  </pic:blipFill>
+                  <pic:spPr>
+                    <a:xfrm>
+                      <a:off x="0" y="0"/>
+                      <a:ext cx="5943600" cy="2807868"/>
+                    </a:xfrm>
+                    <a:prstGeom prst="rect"/>
+                  </pic:spPr>
+                </pic:pic>
+              </a:graphicData>
+            </a:graphic>
+          </wp:inline>
+        </w:drawing>
+      </w:r>
+    </w:p>
+    <w:p>
+      <w:pPr>
+        <w:pStyle w:val="Heading2"/>
+        <w:keepNext/>
+        <w:rPr/>
+      </w:pPr>
+      <w:r>
+        <w:rPr>
+          <w:rtl w:val="0"/>
+        </w:rPr>
+        <w:t>8.5 Team recommendations and confirmation</w:t>
+      </w:r>
+    </w:p>
+    <w:p>
+      <w:pPr>
+        <w:keepNext/>
+        <w:spacing w:line="480" w:lineRule="auto"/>
+        <w:ind w:firstLine="720"/>
+        <w:rPr/>
+      </w:pPr>
+      <w:r>
+        <w:rPr>
+          <w:rtl w:val="0"/>
+        </w:rPr>
+        <w:t>The recommendation screen presents a proposed roster, member roles, invitation status and an explanation based on complementary skills, role coverage, interests and availability. The participant can confirm or decline the invitation. The displayed fit label is illustrative and is not a measured prediction of team success (FR-04, FR-05, NFR-03).</w:t>
+      </w:r>
+    </w:p>
+    <w:p>
+      <w:pPr>
+        <w:keepNext w:val="0"/>
+        <w:spacing w:line="480" w:lineRule="auto" w:after="0"/>
+        <w:ind w:firstLine="0"/>
+        <w:rPr/>
+      </w:pPr>
+      <w:r>
+        <w:drawing>
+          <wp:inline>
+            <wp:extent cx="5943600" cy="3714750"/>
+            <wp:docPr id="8" name="Picture 8"/>
+            <wp:cNvGraphicFramePr>
+              <a:graphicFrameLocks noChangeAspect="1"/>
+            </wp:cNvGraphicFramePr>
+            <a:graphic>
+              <a:graphicData uri="http://schemas.openxmlformats.org/drawingml/2006/picture">
+                <pic:pic>
+                  <pic:nvPicPr>
+                    <pic:cNvPr id="0" name="team_suggestions.png"/>
+                    <pic:cNvPicPr/>
+                  </pic:nvPicPr>
+                  <pic:blipFill>
+                    <a:blip r:embed="rId47"/>
+                    <a:stretch>
+                      <a:fillRect/>
+                    </a:stretch>
+                  </pic:blipFill>
+                  <pic:spPr>
+                    <a:xfrm>
+                      <a:off x="0" y="0"/>
+                      <a:ext cx="5943600" cy="3714750"/>
+                    </a:xfrm>
+                    <a:prstGeom prst="rect"/>
+                  </pic:spPr>
+                </pic:pic>
+              </a:graphicData>
+            </a:graphic>
+          </wp:inline>
+        </w:drawing>
+      </w:r>
+    </w:p>
+    <w:p>
+      <w:pPr>
+        <w:pStyle w:val="Heading2"/>
+        <w:keepNext/>
+        <w:rPr/>
+      </w:pPr>
+      <w:r>
+        <w:rPr>
+          <w:rtl w:val="0"/>
+        </w:rPr>
+        <w:t>8.6 Organiser team management</w:t>
+      </w:r>
+    </w:p>
+    <w:p>
+      <w:pPr>
+        <w:keepNext/>
+        <w:spacing w:line="480" w:lineRule="auto"/>
+        <w:ind w:firstLine="720"/>
+        <w:rPr/>
+      </w:pPr>
+      <w:r>
+        <w:rPr>
+          <w:rtl w:val="0"/>
+        </w:rPr>
+        <w:t>The organiser reviews teams, member roles, pending invitations and compliance with the configured team-size limit. Each team provides a control for moving a participant. The design supports reviewing allocations and making manual adjustments while retaining valid membership constraints (FR-06).</w:t>
+      </w:r>
+    </w:p>
+    <w:p>
+      <w:pPr>
+        <w:keepNext w:val="0"/>
+        <w:spacing w:line="480" w:lineRule="auto" w:after="0"/>
+        <w:ind w:firstLine="0"/>
+        <w:rPr/>
+      </w:pPr>
+      <w:r>
+        <w:drawing>
+          <wp:inline>
+            <wp:extent cx="5943600" cy="3714750"/>
+            <wp:docPr id="9" name="Picture 9"/>
+            <wp:cNvGraphicFramePr>
+              <a:graphicFrameLocks noChangeAspect="1"/>
+            </wp:cNvGraphicFramePr>
+            <a:graphic>
+              <a:graphicData uri="http://schemas.openxmlformats.org/drawingml/2006/picture">
+                <pic:pic>
+                  <pic:nvPicPr>
+                    <pic:cNvPr id="0" name="organizer_teams.png"/>
+                    <pic:cNvPicPr/>
+                  </pic:nvPicPr>
+                  <pic:blipFill>
+                    <a:blip r:embed="rId48"/>
+                    <a:stretch>
+                      <a:fillRect/>
+                    </a:stretch>
+                  </pic:blipFill>
+                  <pic:spPr>
+                    <a:xfrm>
+                      <a:off x="0" y="0"/>
+                      <a:ext cx="5943600" cy="3714750"/>
+                    </a:xfrm>
+                    <a:prstGeom prst="rect"/>
+                  </pic:spPr>
+                </pic:pic>
+              </a:graphicData>
+            </a:graphic>
+          </wp:inline>
+        </w:drawing>
+      </w:r>
+    </w:p>
+    <w:p>
+      <w:pPr>
+        <w:pStyle w:val="Heading2"/>
+        <w:keepNext/>
+        <w:rPr/>
+      </w:pPr>
+      <w:r>
+        <w:rPr>
+          <w:rtl w:val="0"/>
+        </w:rPr>
+        <w:t>8.7 Project evaluation</w:t>
+      </w:r>
+    </w:p>
+    <w:p>
+      <w:pPr>
+        <w:keepNext/>
+        <w:spacing w:line="480" w:lineRule="auto"/>
+        <w:ind w:firstLine="720"/>
+        <w:rPr/>
+      </w:pPr>
+      <w:r>
+        <w:rPr>
+          <w:rtl w:val="0"/>
+        </w:rPr>
+        <w:t>The judge evaluates an assigned project against four rubric criteria, enters comments and reviews the calculated draft total before submitting an evaluation. The example uses an equal-weight scale from 1 to 5; the visible scores illustrate the interface rather than actual project results (FR-08).</w:t>
+      </w:r>
+    </w:p>
+    <w:p>
+      <w:pPr>
+        <w:keepNext w:val="0"/>
+        <w:spacing w:line="480" w:lineRule="auto" w:after="0"/>
+        <w:ind w:firstLine="0"/>
+        <w:rPr/>
+      </w:pPr>
+      <w:r>
+        <w:drawing>
+          <wp:inline>
+            <wp:extent cx="5943600" cy="3714750"/>
+            <wp:docPr id="10" name="Picture 10"/>
+            <wp:cNvGraphicFramePr>
+              <a:graphicFrameLocks noChangeAspect="1"/>
+            </wp:cNvGraphicFramePr>
+            <a:graphic>
+              <a:graphicData uri="http://schemas.openxmlformats.org/drawingml/2006/picture">
+                <pic:pic>
+                  <pic:nvPicPr>
+                    <pic:cNvPr id="0" name="judging.png"/>
+                    <pic:cNvPicPr/>
+                  </pic:nvPicPr>
+                  <pic:blipFill>
+                    <a:blip r:embed="rId49"/>
+                    <a:stretch>
+                      <a:fillRect/>
+                    </a:stretch>
+                  </pic:blipFill>
+                  <pic:spPr>
+                    <a:xfrm>
+                      <a:off x="0" y="0"/>
+                      <a:ext cx="5943600" cy="3714750"/>
+                    </a:xfrm>
+                    <a:prstGeom prst="rect"/>
+                  </pic:spPr>
+                </pic:pic>
+              </a:graphicData>
+            </a:graphic>
+          </wp:inline>
+        </w:drawing>
       </w:r>
     </w:p>
     <w:p>
@@ -9960,7 +10315,7 @@
         <w:rPr>
           <w:rtl w:val="0"/>
         </w:rPr>
-        <w:t>Use one versioned profile dataset and identical team-size, availability and role constraints for all methods. Compare deterministic rule-based allocation, weighted multi-criteria allocation and organiser allocation where an organiser is available. Run random allocation as an additional comparator over 30 recorded seeds. Separate real, consented profiles from synthetic stress cases and report them separately. The questionnaire responses are preference data, not a complete matching-profile dataset.</w:t>
+        <w:t>The algorithm comparison will use a versioned profile dataset with identical team-size, availability and role constraints for all methods. It will compare deterministic rule-based allocation, weighted multi-criteria allocation and organiser allocation where an organiser is available. Random allocation will provide an additional comparator over 30 recorded seeds. Real consented profiles and synthetic stress cases will be evaluated separately. Questionnaire responses describe preferences and will not be treated as complete matching profiles.</w:t>
       </w:r>
     </w:p>
     <w:p>
@@ -9973,7 +10328,7 @@
         <w:rPr>
           <w:rtl w:val="0"/>
         </w:rPr>
-        <w:t>Record dataset size, hardware, code revision, weights, seeds and runtime. Measure valid membership assignments, duplicate memberships, unassigned participants, required-role coverage per team, minimum team coverage, availability overlap, and elapsed formation time. Count mandatory-constraint violations separately from preference scores. Role coverage is filled required roles divided by required roles, averaged over teams; unassigned rate is eligible unassigned participants divided by all eligible participants. Record organiser effort separately from execution time.</w:t>
+        <w:t>Benchmark records will include dataset size, hardware, code revision, weights, random seeds and runtime. Outcome measures are valid membership assignments, duplicate memberships, unassigned participants, required-role coverage, minimum team coverage, availability overlap and elapsed formation time. Mandatory-constraint violations will be counted separately from preference scores. Role coverage is the proportion of required roles filled, averaged over teams. The unassigned rate is the proportion of eligible participants left without a team. Organiser effort will be measured separately from algorithm execution time.</w:t>
       </w:r>
     </w:p>
     <w:p>
@@ -10011,7 +10366,7 @@
         <w:rPr>
           <w:rtl w:val="0"/>
         </w:rPr>
-        <w:t>Recruit 5-8 consenting students and at least one organiser for a formative task trial after the prototype exists. Tasks cover registration, profile editing, understanding a suggestion, accepting or declining a team, and project submission; the organiser creates an event and resolves a team issue. Record unaided completion, time, errors, requests for help and a post-task clarity rating from 1 to 5. Proposed formative gate: at least 80% unaided task completion and no unresolved critical blocker. This small test diagnoses usability problems and does not estimate population-level effectiveness.</w:t>
+        <w:t>A formative usability trial will involve 5-8 consenting students and at least one organiser. Participant tasks will cover registration, profile editing, understanding a suggestion, accepting or declining a team, and project submission. Organiser tasks will cover event creation and resolution of a team issue. Measures will include unaided completion, completion time, errors, requests for help and clarity ratings from 1 to 5. The formative target is at least 80% unaided task completion with no unresolved critical blocker. The small trial will identify usability problems rather than estimate population-wide effectiveness.</w:t>
       </w:r>
     </w:p>
     <w:p>
@@ -10064,7 +10419,7 @@
         <w:rPr>
           <w:rtl w:val="0"/>
         </w:rPr>
-        <w:t>Project documentation is maintained in the hackmatch-diploma GitHub organisation. Separate repositories are available for frontend and backend development. The project README links to the YouTrack board. Repository availability does not establish that implementation or evaluation is complete.</w:t>
+        <w:t>Project documentation is maintained in the hackmatch-diploma GitHub organisation. Separate repositories are available for frontend and backend development. The project README links to the YouTrack board.</w:t>
       </w:r>
     </w:p>
     <w:p>
@@ -10142,7 +10497,7 @@
         <w:rPr>
           <w:rtl w:val="0"/>
         </w:rPr>
-        <w:t>The development workflow links work items to an owner, acceptance criteria, deadline and relevant code or documentation changes. Feature branches and pull requests provide review points; release tags will identify submitted versions. These are planned development practices rather than claims that every review or release checkpoint has already been completed.</w:t>
+        <w:t>The development workflow links work items to an owner, acceptance criteria, deadline and relevant code or documentation changes. Feature branches and pull requests provide review points; release tags will identify submitted versions.</w:t>
       </w:r>
     </w:p>
     <w:p>
@@ -10192,7 +10547,7 @@
         <w:rPr>
           <w:rtl w:val="0"/>
         </w:rPr>
-        <w:t>Priority: 3 x 2 = 6 high. Owner: Elkham Mamedov. Small convenience sample, non-participants and contradictory answers may produce misleading requirements. Trigger: inconsistent experience answers remain unresolved or no organiser is interviewed.</w:t>
+        <w:t>Priority: 3 x 2 = 6 high. Owner: Elkham Mamedov. A small exploratory sample, non-participants and contradictory answers may produce misleading requirements. Trigger: inconsistent experience answers remain unresolved or no organiser is interviewed.</w:t>
       </w:r>
     </w:p>
     <w:p>

</xml_diff>

<commit_message>
Split report into Markdown documents
</commit_message>
<xml_diff>
--- a/docs/report.docx
+++ b/docs/report.docx
@@ -79,6 +79,94 @@
     </w:p>
     <w:p>
       <w:pPr>
+        <w:keepNext/>
+        <w:spacing w:line="480" w:lineRule="auto"/>
+        <w:ind w:firstLine="720"/>
+        <w:rPr/>
+      </w:pPr>
+      <w:r>
+        <w:rPr>
+          <w:b/>
+          <w:rtl w:val="0"/>
+        </w:rPr>
+        <w:t>Elkham Mamedov:</w:t>
+      </w:r>
+      <w:r>
+        <w:rPr>
+          <w:b w:val="0"/>
+          <w:rtl w:val="0"/>
+        </w:rPr>
+        <w:t xml:space="preserve"> responsible for requirements analysis, QA, integration and documentation.</w:t>
+      </w:r>
+    </w:p>
+    <w:p>
+      <w:pPr>
+        <w:keepNext/>
+        <w:spacing w:line="480" w:lineRule="auto"/>
+        <w:ind w:firstLine="720"/>
+        <w:rPr/>
+      </w:pPr>
+      <w:r>
+        <w:rPr>
+          <w:b/>
+          <w:rtl w:val="0"/>
+        </w:rPr>
+        <w:t>Ilnur Saipiyev:</w:t>
+      </w:r>
+      <w:r>
+        <w:rPr>
+          <w:b w:val="0"/>
+          <w:rtl w:val="0"/>
+        </w:rPr>
+        <w:t xml:space="preserve"> responsible for the backend, database and matching algorithm.</w:t>
+      </w:r>
+    </w:p>
+    <w:p>
+      <w:pPr>
+        <w:keepNext/>
+        <w:spacing w:line="480" w:lineRule="auto"/>
+        <w:ind w:firstLine="720"/>
+        <w:rPr/>
+      </w:pPr>
+      <w:r>
+        <w:rPr>
+          <w:b/>
+          <w:rtl w:val="0"/>
+        </w:rPr>
+        <w:t>Alisher Askar:</w:t>
+      </w:r>
+      <w:r>
+        <w:rPr>
+          <w:b w:val="0"/>
+          <w:rtl w:val="0"/>
+        </w:rPr>
+        <w:t xml:space="preserve"> responsible for the frontend.</w:t>
+      </w:r>
+    </w:p>
+    <w:p>
+      <w:pPr>
+        <w:keepNext w:val="0"/>
+        <w:spacing w:line="480" w:lineRule="auto"/>
+        <w:ind w:firstLine="720"/>
+        <w:rPr/>
+      </w:pPr>
+      <w:r>
+        <w:rPr>
+          <w:b/>
+          <w:rtl w:val="0"/>
+        </w:rPr>
+        <w:t>Project stage:</w:t>
+      </w:r>
+      <w:r>
+        <w:rPr>
+          <w:b w:val="0"/>
+          <w:rtl w:val="0"/>
+        </w:rPr>
+        <w:t xml:space="preserve"> analysis, design and initial technical setup.</w:t>
+      </w:r>
+    </w:p>
+    <w:p>
+      <w:pPr>
         <w:pStyle w:val="Heading2"/>
         <w:rPr/>
       </w:pPr>
@@ -659,7 +747,7 @@
         <w:rPr>
           <w:rtl w:val="0"/>
         </w:rPr>
-        <w:t>The Student Hackathon Survey collected 17 submissions. Thirteen respondents agreed to participate and four declined. Questions 2 to 11 each contain 13 responses, and the optional open question contains five responses. The analysis below uses the consenting responses. The questionnaire and screenshots of the response summary accompany this report in the Опросник folder.</w:t>
+        <w:t>The primary data for the project come from the team's Student Hackathon Survey, collected through Google Forms. The response summary contains 17 submissions: 13 respondents consented to participate and four declined. Questions 2 to 11 each contain 13 responses, and Q12 contains five optional text responses. The analysis uses the consenting responses. Counts and percentages below come from the corresponding question summaries, preserved as screenshots in the project repository. The questionnaire link provides the questions; the repository screenshots provide the results used in this report. For questions allowing several selections, percentages use 13 respondents as the denominator and need not sum to 100%.</w:t>
       </w:r>
     </w:p>
     <w:p>
@@ -698,7 +786,7 @@
         <w:rPr>
           <w:rtl w:val="0"/>
         </w:rPr>
-        <w:t>In Q11, registration and profiles received seven selections (53.8%), judging criteria and feedback five (38.5%), and teammate search and announcements four each (30.8%). Q7 recorded three selections for different commitment levels and two for unclear roles. It also contains overlapping no-difficulty and not-applicable selections, so these results are treated as exploratory rather than estimates of problem prevalence. Two open responses suggested pre-event networking or a central platform.</w:t>
+        <w:t>In Q11, registration and profiles received seven selections (53.8%), judging criteria and feedback five (38.5%), and teammate search and announcements four each (30.8%). These choices identify the functions respondents considered useful and support bringing registration, team discovery, event information and judging into one platform. Q8 also recorded two selections each for schedule changes and confusing submission, and one each for scattered information and unclear rules or judging. These are reported concerns within this sample, rather than evidence that every respondent experienced these problems.</w:t>
       </w:r>
     </w:p>
     <w:p>
@@ -711,7 +799,7 @@
         <w:rPr>
           <w:rtl w:val="0"/>
         </w:rPr>
-        <w:t>The results support prioritising registration, participant profiles, transparent judging information and optional teammate discovery. Complementary skills remain a design criterion drawn from the literature; no respondent selected missing skills as an experienced difficulty in Q7.</w:t>
+        <w:t>These findings justify developing a focused HackMatch prototype with registration and profiles as core functions, visible judging criteria and feedback, shared announcements and optional teammate recommendations. Q10 supports keeping the final team decision with participants: six respondents preferred choosing teammates themselves and three preferred suggestions followed by personal choice. The proposed workflow will therefore let participants review recommendations and accept or decline them. The survey establishes priorities for implementation; the evaluation in Section 9 will test whether the resulting system is usable and whether matching meets its stated criteria.</w:t>
       </w:r>
     </w:p>
     <w:p>
@@ -724,8 +812,56 @@
         <w:rPr>
           <w:rtl w:val="0"/>
         </w:rPr>
+        <w:t>Q7 recorded three selections for different commitment levels and two for unclear roles. These responses support making commitment preferences and team roles visible in participant profiles. Two Q12 responses suggested pre-event networking or a central platform, which supports providing a shared place for participant discovery and event activities. Q7 also contains overlapping no-difficulty and not-applicable selections, so these findings are exploratory. No respondent selected missing skills as an experienced difficulty in Q7. Complementary skills are therefore a design criterion informed by the literature in Section 3, rather than a problem demonstrated by this survey.</w:t>
+      </w:r>
+    </w:p>
+    <w:p>
+      <w:pPr>
+        <w:spacing w:line="480" w:lineRule="auto"/>
+        <w:ind w:firstLine="720"/>
+        <w:rPr/>
+      </w:pPr>
+      <w:r>
+        <w:rPr>
+          <w:rtl w:val="0"/>
+        </w:rPr>
+        <w:t>The reason to develop this project is the combination of these locally identified priorities with the gap discussed in Sections 3 and 4: a student hackathon workflow that includes event administration, participant profiles, explainable teammate recommendations and participant confirmation. The survey alone does not establish that existing platforms cannot meet these needs or that the proposed algorithm improves team performance. The platform comparison provides the basis for the development gap, while prototype testing and algorithm evaluation will assess the proposed solution.</w:t>
+      </w:r>
+    </w:p>
+    <w:p>
+      <w:pPr>
+        <w:spacing w:line="480" w:lineRule="auto"/>
+        <w:ind w:firstLine="720"/>
+        <w:rPr/>
+      </w:pPr>
+      <w:r>
+        <w:rPr>
+          <w:rtl w:val="0"/>
+        </w:rPr>
         <w:t>Questionnaire: https://docs.google.com/forms/d/e/1FAIpQLSeZeYzaP4SF2Z0Tic4WnJDYXq45ePErZ1lqkmP_JJAII4qxSQ/viewform</w:t>
       </w:r>
+    </w:p>
+    <w:p>
+      <w:pPr>
+        <w:spacing w:line="480" w:lineRule="auto"/>
+        <w:ind w:firstLine="720"/>
+        <w:rPr/>
+      </w:pPr>
+      <w:r>
+        <w:rPr>
+          <w:rtl w:val="0"/>
+        </w:rPr>
+        <w:t xml:space="preserve">Survey results and supporting screenshots: </w:t>
+      </w:r>
+      <w:hyperlink r:id="rId50">
+        <w:r>
+          <w:rPr>
+            <w:u w:val="single"/>
+            <w:color w:val="000000"/>
+          </w:rPr>
+          <w:t>Опросник folder in the project repository</w:t>
+        </w:r>
+      </w:hyperlink>
     </w:p>
     <w:p>
       <w:pPr>
@@ -10394,19 +10530,6 @@
           <w:rtl w:val="0"/>
         </w:rPr>
         <w:t xml:space="preserve">10. Project Management and Risks</w:t>
-      </w:r>
-    </w:p>
-    <w:p>
-      <w:pPr>
-        <w:spacing w:line="480" w:lineRule="auto"/>
-        <w:ind w:firstLine="720"/>
-        <w:rPr/>
-      </w:pPr>
-      <w:r>
-        <w:rPr>
-          <w:rtl w:val="0"/>
-        </w:rPr>
-        <w:t>Elkham Mamedov is responsible for requirements analysis, QA, integration and documentation. Ilnur Saipiyev is responsible for the backend, database and matching algorithm. Alisher Askar is responsible for the frontend. The project is at the analysis, design and initial technical setup stage.</w:t>
       </w:r>
     </w:p>
     <w:p>

</xml_diff>